<commit_message>
editing files and documents
</commit_message>
<xml_diff>
--- a/docs/LR02/LR02_variant18_report.docx
+++ b/docs/LR02/LR02_variant18_report.docx
@@ -182,7 +182,7 @@
           <w:bCs/>
           <w:lang w:val="ru-RU"/>
         </w:rPr>
-        <w:t>МИК11</w:t>
+        <w:t>Т26ИИКТ-МИК11</w:t>
       </w:r>
     </w:p>
     <w:p>
@@ -199,19 +199,11 @@
         </w:rPr>
         <w:t xml:space="preserve">Проверил(а): </w:t>
       </w:r>
-      <w:proofErr w:type="spellStart"/>
-      <w:r>
-        <w:rPr>
-          <w:lang w:val="ru-RU"/>
-        </w:rPr>
-        <w:t>Трубчик</w:t>
-      </w:r>
-      <w:proofErr w:type="spellEnd"/>
-      <w:r>
-        <w:rPr>
-          <w:lang w:val="ru-RU"/>
-        </w:rPr>
-        <w:t xml:space="preserve"> Ирина Степановна</w:t>
+      <w:r>
+        <w:rPr>
+          <w:lang w:val="ru-RU"/>
+        </w:rPr>
+        <w:t>Трубчик Ирина Степановна</w:t>
       </w:r>
     </w:p>
     <w:p>
@@ -327,35 +319,7 @@
         <w:rPr>
           <w:lang w:val="ru-RU"/>
         </w:rPr>
-        <w:t xml:space="preserve"> = (сценарий − </w:t>
-      </w:r>
-      <w:proofErr w:type="gramStart"/>
-      <w:r>
-        <w:rPr>
-          <w:lang w:val="ru-RU"/>
-        </w:rPr>
-        <w:t>1)·</w:t>
-      </w:r>
-      <w:proofErr w:type="gramEnd"/>
-      <w:r>
-        <w:rPr>
-          <w:lang w:val="ru-RU"/>
-        </w:rPr>
-        <w:t xml:space="preserve">6 + профиль: 18 = (3 − </w:t>
-      </w:r>
-      <w:proofErr w:type="gramStart"/>
-      <w:r>
-        <w:rPr>
-          <w:lang w:val="ru-RU"/>
-        </w:rPr>
-        <w:t>1)·</w:t>
-      </w:r>
-      <w:proofErr w:type="gramEnd"/>
-      <w:r>
-        <w:rPr>
-          <w:lang w:val="ru-RU"/>
-        </w:rPr>
-        <w:t xml:space="preserve">6 + 6. Сценарий 3 — открытый учебный набор университета, профиль 6 — пробелы в происхождении. Обязательные группы рисков: </w:t>
+        <w:t xml:space="preserve"> = (сценарий − 1)·6 + профиль: 18 = (3 − 1)·6 + 6. Сценарий 3 — открытый учебный набор университета, профиль 6 — пробелы в происхождении. Обязательные группы рисков: </w:t>
       </w:r>
       <w:r>
         <w:t>Data</w:t>
@@ -429,55 +393,12 @@
             <w:shd w:val="clear" w:color="auto" w:fill="DCE3EE"/>
           </w:tcPr>
           <w:p>
-            <w:proofErr w:type="spellStart"/>
             <w:r>
               <w:rPr>
                 <w:b/>
                 <w:sz w:val="19"/>
               </w:rPr>
-              <w:t>Условие</w:t>
-            </w:r>
-            <w:proofErr w:type="spellEnd"/>
-            <w:r>
-              <w:rPr>
-                <w:b/>
-                <w:sz w:val="19"/>
-              </w:rPr>
-              <w:t xml:space="preserve"> </w:t>
-            </w:r>
-            <w:proofErr w:type="spellStart"/>
-            <w:r>
-              <w:rPr>
-                <w:b/>
-                <w:sz w:val="19"/>
-              </w:rPr>
-              <w:t>политики</w:t>
-            </w:r>
-            <w:proofErr w:type="spellEnd"/>
-            <w:r>
-              <w:rPr>
-                <w:b/>
-                <w:sz w:val="19"/>
-              </w:rPr>
-              <w:t xml:space="preserve"> (</w:t>
-            </w:r>
-            <w:proofErr w:type="spellStart"/>
-            <w:proofErr w:type="gramStart"/>
-            <w:r>
-              <w:rPr>
-                <w:b/>
-                <w:sz w:val="19"/>
-              </w:rPr>
-              <w:t>policy.json</w:t>
-            </w:r>
-            <w:proofErr w:type="spellEnd"/>
-            <w:proofErr w:type="gramEnd"/>
-            <w:r>
-              <w:rPr>
-                <w:b/>
-                <w:sz w:val="19"/>
-              </w:rPr>
-              <w:t>)</w:t>
+              <w:t>Условие политики (policy.json)</w:t>
             </w:r>
           </w:p>
         </w:tc>
@@ -606,14 +527,12 @@
             <w:tcW w:w="3685" w:type="dxa"/>
           </w:tcPr>
           <w:p>
-            <w:proofErr w:type="spellStart"/>
             <w:r>
               <w:rPr>
                 <w:sz w:val="19"/>
               </w:rPr>
               <w:t>да</w:t>
             </w:r>
-            <w:proofErr w:type="spellEnd"/>
           </w:p>
         </w:tc>
       </w:tr>
@@ -659,29 +578,8 @@
       <w:pPr>
         <w:pStyle w:val="a0"/>
       </w:pPr>
-      <w:proofErr w:type="spellStart"/>
-      <w:r>
-        <w:t>реестр</w:t>
-      </w:r>
-      <w:proofErr w:type="spellEnd"/>
-      <w:r>
-        <w:t xml:space="preserve"> </w:t>
-      </w:r>
-      <w:proofErr w:type="spellStart"/>
-      <w:r>
-        <w:t>рисков</w:t>
-      </w:r>
-      <w:proofErr w:type="spellEnd"/>
-      <w:r>
-        <w:t xml:space="preserve"> </w:t>
-      </w:r>
-      <w:proofErr w:type="spellStart"/>
-      <w:r>
-        <w:t>даёт</w:t>
-      </w:r>
-      <w:proofErr w:type="spellEnd"/>
-      <w:r>
-        <w:t xml:space="preserve"> RESULT: PASS и включает Data Privacy и Harmful Bias or Homogenization;</w:t>
+      <w:r>
+        <w:t>реестр рисков даёт RESULT: PASS и включает Data Privacy и Harmful Bias or Homogenization;</w:t>
       </w:r>
     </w:p>
     <w:p>
@@ -805,21 +703,7 @@
         <w:rPr>
           <w:lang w:val="ru-RU"/>
         </w:rPr>
-        <w:t>02 (</w:t>
-      </w:r>
-      <w:proofErr w:type="spellStart"/>
-      <w:r>
-        <w:rPr>
-          <w:lang w:val="ru-RU"/>
-        </w:rPr>
-        <w:t>хеш</w:t>
-      </w:r>
-      <w:proofErr w:type="spellEnd"/>
-      <w:r>
-        <w:rPr>
-          <w:lang w:val="ru-RU"/>
-        </w:rPr>
-        <w:t xml:space="preserve"> как у </w:t>
+        <w:t xml:space="preserve">02 (хеш как у </w:t>
       </w:r>
       <w:r>
         <w:t>item</w:t>
@@ -837,21 +721,7 @@
         <w:rPr>
           <w:lang w:val="ru-RU"/>
         </w:rPr>
-        <w:t>08 (</w:t>
-      </w:r>
-      <w:proofErr w:type="spellStart"/>
-      <w:r>
-        <w:rPr>
-          <w:lang w:val="ru-RU"/>
-        </w:rPr>
-        <w:t>хеш</w:t>
-      </w:r>
-      <w:proofErr w:type="spellEnd"/>
-      <w:r>
-        <w:rPr>
-          <w:lang w:val="ru-RU"/>
-        </w:rPr>
-        <w:t xml:space="preserve"> как у </w:t>
+        <w:t xml:space="preserve">08 (хеш как у </w:t>
       </w:r>
       <w:r>
         <w:t>item</w:t>
@@ -878,21 +748,7 @@
         <w:rPr>
           <w:lang w:val="ru-RU"/>
         </w:rPr>
-        <w:t xml:space="preserve">02 — файлы разных типов с одним </w:t>
-      </w:r>
-      <w:proofErr w:type="spellStart"/>
-      <w:r>
-        <w:rPr>
-          <w:lang w:val="ru-RU"/>
-        </w:rPr>
-        <w:t>хешем</w:t>
-      </w:r>
-      <w:proofErr w:type="spellEnd"/>
-      <w:r>
-        <w:rPr>
-          <w:lang w:val="ru-RU"/>
-        </w:rPr>
-        <w:t xml:space="preserve">; </w:t>
+        <w:t xml:space="preserve">02 — файлы разных типов с одним хешем; </w:t>
       </w:r>
       <w:r>
         <w:t>item</w:t>
@@ -984,11 +840,9 @@
         </w:rPr>
         <w:t>.</w:t>
       </w:r>
-      <w:proofErr w:type="spellStart"/>
       <w:r>
         <w:t>py</w:t>
       </w:r>
-      <w:proofErr w:type="spellEnd"/>
       <w:r>
         <w:rPr>
           <w:lang w:val="ru-RU"/>
@@ -1040,21 +894,7 @@
         <w:rPr>
           <w:lang w:val="ru-RU"/>
         </w:rPr>
-        <w:t xml:space="preserve">учебная модель правил упрощена и не является юридической консультацией. Скрипт видит только записи манифеста: он не проверяет, что лицензия принадлежит объекту, что источник существует и что </w:t>
-      </w:r>
-      <w:proofErr w:type="spellStart"/>
-      <w:r>
-        <w:rPr>
-          <w:lang w:val="ru-RU"/>
-        </w:rPr>
-        <w:t>хеш</w:t>
-      </w:r>
-      <w:proofErr w:type="spellEnd"/>
-      <w:r>
-        <w:rPr>
-          <w:lang w:val="ru-RU"/>
-        </w:rPr>
-        <w:t xml:space="preserve"> соответствует файлу.</w:t>
+        <w:t>учебная модель правил упрощена и не является юридической консультацией. Скрипт видит только записи манифеста: он не проверяет, что лицензия принадлежит объекту, что источник существует и что хеш соответствует файлу.</w:t>
       </w:r>
     </w:p>
     <w:p>
@@ -1319,21 +1159,7 @@
         <w:rPr>
           <w:lang w:val="ru-RU"/>
         </w:rPr>
-        <w:t xml:space="preserve"> =</w:t>
-      </w:r>
-      <w:proofErr w:type="gramStart"/>
-      <w:r>
-        <w:rPr>
-          <w:lang w:val="ru-RU"/>
-        </w:rPr>
-        <w:t xml:space="preserve"> ../..</w:t>
-      </w:r>
-      <w:proofErr w:type="gramEnd"/>
-      <w:r>
-        <w:rPr>
-          <w:lang w:val="ru-RU"/>
-        </w:rPr>
-        <w:t>/</w:t>
+        <w:t xml:space="preserve"> = ../../</w:t>
       </w:r>
       <w:r>
         <w:t>LR</w:t>
@@ -1351,21 +1177,11 @@
         <w:rPr>
           <w:lang w:val="ru-RU"/>
         </w:rPr>
-        <w:t>01</w:t>
-      </w:r>
-      <w:proofErr w:type="gramStart"/>
-      <w:r>
-        <w:rPr>
-          <w:lang w:val="ru-RU"/>
-        </w:rPr>
-        <w:t>/.</w:t>
-      </w:r>
-      <w:proofErr w:type="spellStart"/>
+        <w:t>01/.</w:t>
+      </w:r>
       <w:r>
         <w:t>venv</w:t>
       </w:r>
-      <w:proofErr w:type="spellEnd"/>
-      <w:proofErr w:type="gramEnd"/>
       <w:r>
         <w:rPr>
           <w:lang w:val="ru-RU"/>
@@ -1547,21 +1363,7 @@
         <w:rPr>
           <w:lang w:val="ru-RU"/>
         </w:rPr>
-        <w:t xml:space="preserve"> совпал </w:t>
-      </w:r>
-      <w:proofErr w:type="spellStart"/>
-      <w:r>
-        <w:rPr>
-          <w:lang w:val="ru-RU"/>
-        </w:rPr>
-        <w:t>побитово</w:t>
-      </w:r>
-      <w:proofErr w:type="spellEnd"/>
-      <w:r>
-        <w:rPr>
-          <w:lang w:val="ru-RU"/>
-        </w:rPr>
-        <w:t xml:space="preserve">, остальные пять файлов совпали по содержимому, но различаются переводами строк. Демо выполнено на </w:t>
+        <w:t xml:space="preserve"> совпал побитово, остальные пять файлов совпали по содержимому, но различаются переводами строк. Демо выполнено на </w:t>
       </w:r>
       <w:r>
         <w:t>Windows</w:t>
@@ -1654,31 +1456,7 @@
         <w:t xml:space="preserve"> на обеих ОС. Вывод: текстовые артефакты нужно сравнивать после нормализации переводов строк, а ОС записывать в журнал. </w:t>
       </w:r>
       <w:r>
-        <w:t xml:space="preserve">Это </w:t>
-      </w:r>
-      <w:proofErr w:type="spellStart"/>
-      <w:r>
-        <w:t>аналог</w:t>
-      </w:r>
-      <w:proofErr w:type="spellEnd"/>
-      <w:r>
-        <w:t xml:space="preserve"> PNG/</w:t>
-      </w:r>
-      <w:proofErr w:type="spellStart"/>
-      <w:r>
-        <w:t>zlib</w:t>
-      </w:r>
-      <w:proofErr w:type="spellEnd"/>
-      <w:r>
-        <w:t xml:space="preserve"> </w:t>
-      </w:r>
-      <w:proofErr w:type="spellStart"/>
-      <w:r>
-        <w:t>из</w:t>
-      </w:r>
-      <w:proofErr w:type="spellEnd"/>
-      <w:r>
-        <w:t xml:space="preserve"> ЛР 1.</w:t>
+        <w:t>Это аналог PNG/zlib из ЛР 1.</w:t>
       </w:r>
     </w:p>
     <w:p>
@@ -1991,23 +1769,7 @@
                 <w:sz w:val="19"/>
                 <w:lang w:val="ru-RU"/>
               </w:rPr>
-              <w:t xml:space="preserve">02 до пересчёта </w:t>
-            </w:r>
-            <w:proofErr w:type="spellStart"/>
-            <w:r>
-              <w:rPr>
-                <w:sz w:val="19"/>
-                <w:lang w:val="ru-RU"/>
-              </w:rPr>
-              <w:t>хешей</w:t>
-            </w:r>
-            <w:proofErr w:type="spellEnd"/>
-            <w:r>
-              <w:rPr>
-                <w:sz w:val="19"/>
-                <w:lang w:val="ru-RU"/>
-              </w:rPr>
-              <w:t xml:space="preserve"> по файлам (см. п. 2)</w:t>
+              <w:t>02 до пересчёта хешей по файлам (см. п. 2)</w:t>
             </w:r>
           </w:p>
         </w:tc>
@@ -2310,23 +2072,7 @@
                 <w:sz w:val="19"/>
                 <w:lang w:val="ru-RU"/>
               </w:rPr>
-              <w:t xml:space="preserve">08: пересчёт </w:t>
-            </w:r>
-            <w:proofErr w:type="spellStart"/>
-            <w:r>
-              <w:rPr>
-                <w:sz w:val="19"/>
-                <w:lang w:val="ru-RU"/>
-              </w:rPr>
-              <w:t>хешей</w:t>
-            </w:r>
-            <w:proofErr w:type="spellEnd"/>
-            <w:r>
-              <w:rPr>
-                <w:sz w:val="19"/>
-                <w:lang w:val="ru-RU"/>
-              </w:rPr>
-              <w:t xml:space="preserve"> и выяснение правообладателя</w:t>
+              <w:t>08: пересчёт хешей и выяснение правообладателя</w:t>
             </w:r>
           </w:p>
         </w:tc>
@@ -2617,15 +2363,28 @@
                 <w:sz w:val="19"/>
                 <w:lang w:val="ru-RU"/>
               </w:rPr>
-              <w:t xml:space="preserve">Настоящий дубликат у файлов разного типа невозможен, вероятнее ошибка </w:t>
+              <w:t>Настоящий дубликат у файлов разного типа невозможен, вероятнее ошибка контрольной суммы в манифесте. Правило помечает второе вхождение (</w:t>
+            </w:r>
+            <w:r>
+              <w:rPr>
+                <w:sz w:val="19"/>
+              </w:rPr>
+              <w:t>item</w:t>
             </w:r>
             <w:r>
               <w:rPr>
                 <w:sz w:val="19"/>
                 <w:lang w:val="ru-RU"/>
               </w:rPr>
+              <w:t xml:space="preserve">02), но ошибочный хеш может быть у любого </w:t>
+            </w:r>
+            <w:r>
+              <w:rPr>
+                <w:sz w:val="19"/>
+                <w:lang w:val="ru-RU"/>
+              </w:rPr>
               <w:lastRenderedPageBreak/>
-              <w:t>контрольной суммы в манифесте. Правило помечает второе вхождение (</w:t>
+              <w:t xml:space="preserve">из двух, поэтому исключать </w:t>
             </w:r>
             <w:r>
               <w:rPr>
@@ -2638,52 +2397,7 @@
                 <w:sz w:val="19"/>
                 <w:lang w:val="ru-RU"/>
               </w:rPr>
-              <w:t xml:space="preserve">02), но ошибочный </w:t>
-            </w:r>
-            <w:proofErr w:type="spellStart"/>
-            <w:r>
-              <w:rPr>
-                <w:sz w:val="19"/>
-                <w:lang w:val="ru-RU"/>
-              </w:rPr>
-              <w:t>хеш</w:t>
-            </w:r>
-            <w:proofErr w:type="spellEnd"/>
-            <w:r>
-              <w:rPr>
-                <w:sz w:val="19"/>
-                <w:lang w:val="ru-RU"/>
-              </w:rPr>
-              <w:t xml:space="preserve"> может быть у любого из двух, поэтому исключать </w:t>
-            </w:r>
-            <w:r>
-              <w:rPr>
-                <w:sz w:val="19"/>
-              </w:rPr>
-              <w:t>item</w:t>
-            </w:r>
-            <w:r>
-              <w:rPr>
-                <w:sz w:val="19"/>
-                <w:lang w:val="ru-RU"/>
-              </w:rPr>
-              <w:t xml:space="preserve">02 «по отчёту» нельзя. Если после пересчёта </w:t>
-            </w:r>
-            <w:proofErr w:type="spellStart"/>
-            <w:r>
-              <w:rPr>
-                <w:sz w:val="19"/>
-                <w:lang w:val="ru-RU"/>
-              </w:rPr>
-              <w:t>хеши</w:t>
-            </w:r>
-            <w:proofErr w:type="spellEnd"/>
-            <w:r>
-              <w:rPr>
-                <w:sz w:val="19"/>
-                <w:lang w:val="ru-RU"/>
-              </w:rPr>
-              <w:t xml:space="preserve"> разные — оба принимаются, а манифест исправляется.</w:t>
+              <w:t>02 «по отчёту» нельзя. Если после пересчёта хеши разные — оба принимаются, а манифест исправляется.</w:t>
             </w:r>
           </w:p>
         </w:tc>
@@ -2692,7 +2406,6 @@
             <w:tcW w:w="1995" w:type="dxa"/>
           </w:tcPr>
           <w:p>
-            <w:proofErr w:type="spellStart"/>
             <w:r>
               <w:rPr>
                 <w:sz w:val="19"/>
@@ -2700,7 +2413,6 @@
               <w:lastRenderedPageBreak/>
               <w:t>инженерный</w:t>
             </w:r>
-            <w:proofErr w:type="spellEnd"/>
           </w:p>
         </w:tc>
       </w:tr>
@@ -2754,23 +2466,7 @@
                 <w:sz w:val="19"/>
                 <w:lang w:val="ru-RU"/>
               </w:rPr>
-              <w:t xml:space="preserve">: пересчитать </w:t>
-            </w:r>
-            <w:proofErr w:type="spellStart"/>
-            <w:r>
-              <w:rPr>
-                <w:sz w:val="19"/>
-                <w:lang w:val="ru-RU"/>
-              </w:rPr>
-              <w:t>хеши</w:t>
-            </w:r>
-            <w:proofErr w:type="spellEnd"/>
-            <w:r>
-              <w:rPr>
-                <w:sz w:val="19"/>
-                <w:lang w:val="ru-RU"/>
-              </w:rPr>
-              <w:t>; при подтверждённом дубликате оставить одну копию, но только после выяснения правообладателя</w:t>
+              <w:t>: пересчитать хеши; при подтверждённом дубликате оставить одну копию, но только после выяснения правообладателя</w:t>
             </w:r>
           </w:p>
         </w:tc>
@@ -2860,23 +2556,7 @@
                 <w:sz w:val="19"/>
                 <w:lang w:val="ru-RU"/>
               </w:rPr>
-              <w:t>инженерный (</w:t>
-            </w:r>
-            <w:proofErr w:type="spellStart"/>
-            <w:r>
-              <w:rPr>
-                <w:sz w:val="19"/>
-                <w:lang w:val="ru-RU"/>
-              </w:rPr>
-              <w:t>хеш</w:t>
-            </w:r>
-            <w:proofErr w:type="spellEnd"/>
-            <w:r>
-              <w:rPr>
-                <w:sz w:val="19"/>
-                <w:lang w:val="ru-RU"/>
-              </w:rPr>
-              <w:t>) + правообладатель / юрист (автор)</w:t>
+              <w:t>инженерный (хеш) + правообладатель / юрист (автор)</w:t>
             </w:r>
           </w:p>
         </w:tc>
@@ -2991,14 +2671,12 @@
             <w:tcW w:w="1995" w:type="dxa"/>
           </w:tcPr>
           <w:p>
-            <w:proofErr w:type="spellStart"/>
             <w:r>
               <w:rPr>
                 <w:sz w:val="19"/>
               </w:rPr>
               <w:t>инженерный</w:t>
             </w:r>
-            <w:proofErr w:type="spellEnd"/>
           </w:p>
         </w:tc>
       </w:tr>
@@ -3052,31 +2730,7 @@
                 <w:sz w:val="19"/>
                 <w:lang w:val="ru-RU"/>
               </w:rPr>
-              <w:t xml:space="preserve">: не публиковать, пока источник не восстановлен (поиск по имени файла и </w:t>
-            </w:r>
-            <w:proofErr w:type="spellStart"/>
-            <w:r>
-              <w:rPr>
-                <w:sz w:val="19"/>
-                <w:lang w:val="ru-RU"/>
-              </w:rPr>
-              <w:t>хешу</w:t>
-            </w:r>
-            <w:proofErr w:type="spellEnd"/>
-            <w:r>
-              <w:rPr>
-                <w:sz w:val="19"/>
-                <w:lang w:val="ru-RU"/>
-              </w:rPr>
-              <w:t xml:space="preserve"> в журналах загрузки, запрос </w:t>
-            </w:r>
-            <w:r>
-              <w:rPr>
-                <w:sz w:val="19"/>
-                <w:lang w:val="ru-RU"/>
-              </w:rPr>
-              <w:lastRenderedPageBreak/>
-              <w:t>Автор-21)</w:t>
+              <w:t>: не публиковать, пока источник не восстановлен (поиск по имени файла и хешу в журналах загрузки, запрос Автор-21)</w:t>
             </w:r>
           </w:p>
         </w:tc>
@@ -3095,7 +2749,6 @@
                 <w:sz w:val="19"/>
                 <w:lang w:val="ru-RU"/>
               </w:rPr>
-              <w:lastRenderedPageBreak/>
               <w:t xml:space="preserve">Заявлена лицензия </w:t>
             </w:r>
             <w:r>
@@ -3122,15 +2775,7 @@
                 <w:sz w:val="19"/>
                 <w:lang w:val="ru-RU"/>
               </w:rPr>
-              <w:t xml:space="preserve">0 — риск: если она </w:t>
-            </w:r>
-            <w:r>
-              <w:rPr>
-                <w:sz w:val="19"/>
-                <w:lang w:val="ru-RU"/>
-              </w:rPr>
-              <w:lastRenderedPageBreak/>
-              <w:t>ошибочна, университет распространит чужой материал.</w:t>
+              <w:t>0 — риск: если она ошибочна, университет распространит чужой материал.</w:t>
             </w:r>
           </w:p>
         </w:tc>
@@ -3139,43 +2784,12 @@
             <w:tcW w:w="1995" w:type="dxa"/>
           </w:tcPr>
           <w:p>
-            <w:proofErr w:type="spellStart"/>
-            <w:r>
-              <w:rPr>
-                <w:sz w:val="19"/>
-              </w:rPr>
-              <w:lastRenderedPageBreak/>
-              <w:t>инженерный</w:t>
-            </w:r>
-            <w:proofErr w:type="spellEnd"/>
-            <w:r>
-              <w:rPr>
-                <w:sz w:val="19"/>
-              </w:rPr>
-              <w:t xml:space="preserve"> (</w:t>
-            </w:r>
-            <w:proofErr w:type="spellStart"/>
-            <w:r>
-              <w:rPr>
-                <w:sz w:val="19"/>
-              </w:rPr>
-              <w:t>поиск</w:t>
-            </w:r>
-            <w:proofErr w:type="spellEnd"/>
-            <w:r>
-              <w:rPr>
-                <w:sz w:val="19"/>
-              </w:rPr>
-              <w:t xml:space="preserve">) + </w:t>
-            </w:r>
-            <w:proofErr w:type="spellStart"/>
-            <w:r>
-              <w:rPr>
-                <w:sz w:val="19"/>
-              </w:rPr>
-              <w:t>правообладатель</w:t>
-            </w:r>
-            <w:proofErr w:type="spellEnd"/>
+            <w:r>
+              <w:rPr>
+                <w:sz w:val="19"/>
+              </w:rPr>
+              <w:t>инженерный (поиск) + правообладатель</w:t>
+            </w:r>
           </w:p>
         </w:tc>
       </w:tr>
@@ -3282,7 +2896,15 @@
                 <w:sz w:val="19"/>
                 <w:lang w:val="ru-RU"/>
               </w:rPr>
-              <w:t>-4.0 требует корректного указания автора и источника, а без источника это требование не выполнить.</w:t>
+              <w:t xml:space="preserve">-4.0 требует корректного указания автора и источника, а без источника это требование не </w:t>
+            </w:r>
+            <w:r>
+              <w:rPr>
+                <w:sz w:val="19"/>
+                <w:lang w:val="ru-RU"/>
+              </w:rPr>
+              <w:lastRenderedPageBreak/>
+              <w:t>выполнить.</w:t>
             </w:r>
           </w:p>
         </w:tc>
@@ -3291,14 +2913,13 @@
             <w:tcW w:w="1995" w:type="dxa"/>
           </w:tcPr>
           <w:p>
-            <w:proofErr w:type="spellStart"/>
-            <w:r>
-              <w:rPr>
-                <w:sz w:val="19"/>
-              </w:rPr>
+            <w:r>
+              <w:rPr>
+                <w:sz w:val="19"/>
+              </w:rPr>
+              <w:lastRenderedPageBreak/>
               <w:t>правообладатель</w:t>
             </w:r>
-            <w:proofErr w:type="spellEnd"/>
           </w:p>
         </w:tc>
       </w:tr>
@@ -3546,21 +3167,7 @@
         <w:rPr>
           <w:lang w:val="ru-RU"/>
         </w:rPr>
-        <w:t xml:space="preserve">В первую публикацию сейчас могут войти 6 из 12 объектов. После пересчёта </w:t>
-      </w:r>
-      <w:proofErr w:type="spellStart"/>
-      <w:r>
-        <w:rPr>
-          <w:lang w:val="ru-RU"/>
-        </w:rPr>
-        <w:t>хешей</w:t>
-      </w:r>
-      <w:proofErr w:type="spellEnd"/>
-      <w:r>
-        <w:rPr>
-          <w:lang w:val="ru-RU"/>
-        </w:rPr>
-        <w:t xml:space="preserve"> и ответов</w:t>
+        <w:t>В первую публикацию сейчас могут войти 6 из 12 объектов. После пересчёта хешей и ответов</w:t>
       </w:r>
     </w:p>
     <w:p>
@@ -3790,7 +3397,6 @@
           <w:b/>
           <w:lang w:val="ru-RU"/>
         </w:rPr>
-        <w:lastRenderedPageBreak/>
         <w:t>Смешанные лицензии.</w:t>
       </w:r>
       <w:r>
@@ -3949,6 +3555,7 @@
         <w:pStyle w:val="31"/>
       </w:pPr>
       <w:r>
+        <w:lastRenderedPageBreak/>
         <w:t>1. Motivation (мотивация)</w:t>
       </w:r>
     </w:p>
@@ -4024,29 +3631,8 @@
         </w:rPr>
         <w:t xml:space="preserve"> [ФИО], в рамках ЛР 2 (вариант 18). </w:t>
       </w:r>
-      <w:proofErr w:type="spellStart"/>
-      <w:r>
-        <w:t>Финансирования</w:t>
-      </w:r>
-      <w:proofErr w:type="spellEnd"/>
-      <w:r>
-        <w:t xml:space="preserve"> и </w:t>
-      </w:r>
-      <w:proofErr w:type="spellStart"/>
-      <w:r>
-        <w:t>заказчика</w:t>
-      </w:r>
-      <w:proofErr w:type="spellEnd"/>
-      <w:r>
-        <w:t xml:space="preserve"> </w:t>
-      </w:r>
-      <w:proofErr w:type="spellStart"/>
-      <w:r>
-        <w:t>нет</w:t>
-      </w:r>
-      <w:proofErr w:type="spellEnd"/>
-      <w:r>
-        <w:t>.</w:t>
+      <w:r>
+        <w:t>Финансирования и заказчика нет.</w:t>
       </w:r>
     </w:p>
     <w:p>
@@ -4153,13 +3739,8 @@
         </w:rPr>
         <w:t xml:space="preserve">0-1.0 — 1. </w:t>
       </w:r>
-      <w:proofErr w:type="spellStart"/>
-      <w:r>
-        <w:t>Условий</w:t>
-      </w:r>
-      <w:proofErr w:type="spellEnd"/>
-      <w:r>
-        <w:t xml:space="preserve"> NC, ND и SA нет.</w:t>
+      <w:r>
+        <w:t>Условий NC, ND и SA нет.</w:t>
       </w:r>
     </w:p>
     <w:p>
@@ -4226,47 +3807,11 @@
       <w:pPr>
         <w:pStyle w:val="a0"/>
       </w:pPr>
-      <w:proofErr w:type="spellStart"/>
       <w:r>
         <w:rPr>
           <w:b/>
         </w:rPr>
-        <w:t>Известные</w:t>
-      </w:r>
-      <w:proofErr w:type="spellEnd"/>
-      <w:r>
-        <w:rPr>
-          <w:b/>
-        </w:rPr>
-        <w:t xml:space="preserve"> </w:t>
-      </w:r>
-      <w:proofErr w:type="spellStart"/>
-      <w:r>
-        <w:rPr>
-          <w:b/>
-        </w:rPr>
-        <w:t>проблемы</w:t>
-      </w:r>
-      <w:proofErr w:type="spellEnd"/>
-      <w:r>
-        <w:rPr>
-          <w:b/>
-        </w:rPr>
-        <w:t xml:space="preserve"> </w:t>
-      </w:r>
-      <w:proofErr w:type="spellStart"/>
-      <w:r>
-        <w:rPr>
-          <w:b/>
-        </w:rPr>
-        <w:t>состава</w:t>
-      </w:r>
-      <w:proofErr w:type="spellEnd"/>
-      <w:r>
-        <w:rPr>
-          <w:b/>
-        </w:rPr>
-        <w:t>:</w:t>
+        <w:t>Известные проблемы состава:</w:t>
       </w:r>
     </w:p>
     <w:p>
@@ -4332,21 +3877,7 @@
         <w:rPr>
           <w:lang w:val="ru-RU"/>
         </w:rPr>
-        <w:t xml:space="preserve">7 </w:t>
-      </w:r>
-      <w:proofErr w:type="spellStart"/>
-      <w:r>
-        <w:rPr>
-          <w:lang w:val="ru-RU"/>
-        </w:rPr>
-        <w:t>медиаобъектов</w:t>
-      </w:r>
-      <w:proofErr w:type="spellEnd"/>
-      <w:r>
-        <w:rPr>
-          <w:lang w:val="ru-RU"/>
-        </w:rPr>
-        <w:t xml:space="preserve"> помечены лицензиями на ПО (</w:t>
+        <w:t>7 медиаобъектов помечены лицензиями на ПО (</w:t>
       </w:r>
       <w:r>
         <w:t>MIT</w:t>
@@ -4372,23 +3903,7 @@
         <w:pStyle w:val="31"/>
       </w:pPr>
       <w:r>
-        <w:t>3. Collection Process (</w:t>
-      </w:r>
-      <w:proofErr w:type="spellStart"/>
-      <w:r>
-        <w:t>процесс</w:t>
-      </w:r>
-      <w:proofErr w:type="spellEnd"/>
-      <w:r>
-        <w:t xml:space="preserve"> </w:t>
-      </w:r>
-      <w:proofErr w:type="spellStart"/>
-      <w:r>
-        <w:t>сбора</w:t>
-      </w:r>
-      <w:proofErr w:type="spellEnd"/>
-      <w:r>
-        <w:t>)</w:t>
+        <w:t>3. Collection Process (процесс сбора)</w:t>
       </w:r>
     </w:p>
     <w:p>
@@ -4566,23 +4081,7 @@
         <w:t xml:space="preserve">Кто именно и каким способом их скачивал, в манифесте не записано. </w:t>
       </w:r>
       <w:r>
-        <w:t xml:space="preserve">Это </w:t>
-      </w:r>
-      <w:proofErr w:type="spellStart"/>
-      <w:r>
-        <w:t>пробел</w:t>
-      </w:r>
-      <w:proofErr w:type="spellEnd"/>
-      <w:r>
-        <w:t xml:space="preserve">, о </w:t>
-      </w:r>
-      <w:proofErr w:type="spellStart"/>
-      <w:r>
-        <w:t>нём</w:t>
-      </w:r>
-      <w:proofErr w:type="spellEnd"/>
-      <w:r>
-        <w:t xml:space="preserve"> сказано в разделе 7.</w:t>
+        <w:t>Это пробел, о нём сказано в разделе 7.</w:t>
       </w:r>
     </w:p>
     <w:p>
@@ -4596,7 +4095,6 @@
         <w:rPr>
           <w:lang w:val="ru-RU"/>
         </w:rPr>
-        <w:lastRenderedPageBreak/>
         <w:t>Согласия на обработку персональных данных не собирались, потому что персональных данных в наборе нет.</w:t>
       </w:r>
     </w:p>
@@ -4768,6 +4266,7 @@
           <w:b/>
           <w:lang w:val="ru-RU"/>
         </w:rPr>
+        <w:lastRenderedPageBreak/>
         <w:t>Карантин</w:t>
       </w:r>
       <w:r>
@@ -4936,29 +4435,8 @@
         </w:rPr>
         <w:t xml:space="preserve">Предполагаемое: открытый учебный набор университета (некоммерческий). </w:t>
       </w:r>
-      <w:proofErr w:type="spellStart"/>
-      <w:r>
-        <w:t>Коммерческое</w:t>
-      </w:r>
-      <w:proofErr w:type="spellEnd"/>
-      <w:r>
-        <w:t xml:space="preserve"> </w:t>
-      </w:r>
-      <w:proofErr w:type="spellStart"/>
-      <w:r>
-        <w:t>использование</w:t>
-      </w:r>
-      <w:proofErr w:type="spellEnd"/>
-      <w:r>
-        <w:t xml:space="preserve"> — </w:t>
-      </w:r>
-      <w:proofErr w:type="spellStart"/>
-      <w:r>
-        <w:t>нет</w:t>
-      </w:r>
-      <w:proofErr w:type="spellEnd"/>
-      <w:r>
-        <w:t>,</w:t>
+      <w:r>
+        <w:t>Коммерческое использование — нет,</w:t>
       </w:r>
     </w:p>
     <w:p>
@@ -4999,47 +4477,11 @@
       <w:pPr>
         <w:pStyle w:val="a0"/>
       </w:pPr>
-      <w:proofErr w:type="spellStart"/>
       <w:r>
         <w:rPr>
           <w:b/>
         </w:rPr>
-        <w:t>Не</w:t>
-      </w:r>
-      <w:proofErr w:type="spellEnd"/>
-      <w:r>
-        <w:rPr>
-          <w:b/>
-        </w:rPr>
-        <w:t xml:space="preserve"> </w:t>
-      </w:r>
-      <w:proofErr w:type="spellStart"/>
-      <w:r>
-        <w:rPr>
-          <w:b/>
-        </w:rPr>
-        <w:t>подходит</w:t>
-      </w:r>
-      <w:proofErr w:type="spellEnd"/>
-      <w:r>
-        <w:rPr>
-          <w:b/>
-        </w:rPr>
-        <w:t xml:space="preserve"> </w:t>
-      </w:r>
-      <w:proofErr w:type="spellStart"/>
-      <w:r>
-        <w:rPr>
-          <w:b/>
-        </w:rPr>
-        <w:t>для</w:t>
-      </w:r>
-      <w:proofErr w:type="spellEnd"/>
-      <w:r>
-        <w:rPr>
-          <w:b/>
-        </w:rPr>
-        <w:t>:</w:t>
+        <w:t>Не подходит для:</w:t>
       </w:r>
     </w:p>
     <w:p>
@@ -5175,29 +4617,8 @@
       </w:r>
     </w:p>
     <w:p>
-      <w:proofErr w:type="spellStart"/>
-      <w:r>
-        <w:t>Вместе</w:t>
-      </w:r>
-      <w:proofErr w:type="spellEnd"/>
-      <w:r>
-        <w:t xml:space="preserve"> с </w:t>
-      </w:r>
-      <w:proofErr w:type="spellStart"/>
-      <w:r>
-        <w:t>набором</w:t>
-      </w:r>
-      <w:proofErr w:type="spellEnd"/>
-      <w:r>
-        <w:t xml:space="preserve"> </w:t>
-      </w:r>
-      <w:proofErr w:type="spellStart"/>
-      <w:r>
-        <w:t>публикуются</w:t>
-      </w:r>
-      <w:proofErr w:type="spellEnd"/>
-      <w:r>
-        <w:t>:</w:t>
+      <w:r>
+        <w:t>Вместе с набором публикуются:</w:t>
       </w:r>
     </w:p>
     <w:p>
@@ -5212,7 +4633,6 @@
         <w:rPr>
           <w:rFonts w:ascii="Courier New" w:eastAsia="Courier New" w:hAnsi="Courier New"/>
         </w:rPr>
-        <w:lastRenderedPageBreak/>
         <w:t>manifest</w:t>
       </w:r>
       <w:r>
@@ -5240,37 +4660,8 @@
         <w:pStyle w:val="a0"/>
         <w:ind w:left="850"/>
       </w:pPr>
-      <w:proofErr w:type="spellStart"/>
-      <w:r>
-        <w:t>файл</w:t>
-      </w:r>
-      <w:proofErr w:type="spellEnd"/>
-      <w:r>
-        <w:t xml:space="preserve"> ATTRIBUTION </w:t>
-      </w:r>
-      <w:proofErr w:type="spellStart"/>
-      <w:r>
-        <w:t>со</w:t>
-      </w:r>
-      <w:proofErr w:type="spellEnd"/>
-      <w:r>
-        <w:t xml:space="preserve"> </w:t>
-      </w:r>
-      <w:proofErr w:type="spellStart"/>
-      <w:r>
-        <w:t>списком</w:t>
-      </w:r>
-      <w:proofErr w:type="spellEnd"/>
-      <w:r>
-        <w:t xml:space="preserve"> </w:t>
-      </w:r>
-      <w:proofErr w:type="spellStart"/>
-      <w:r>
-        <w:t>авторов</w:t>
-      </w:r>
-      <w:proofErr w:type="spellEnd"/>
-      <w:r>
-        <w:t xml:space="preserve"> (для CC-BY-4.0, MIT, Apache-2.0);</w:t>
+      <w:r>
+        <w:t>файл ATTRIBUTION со списком авторов (для CC-BY-4.0, MIT, Apache-2.0);</w:t>
       </w:r>
     </w:p>
     <w:p>
@@ -5311,21 +4702,8 @@
         <w:pStyle w:val="a0"/>
         <w:ind w:left="850"/>
       </w:pPr>
-      <w:proofErr w:type="spellStart"/>
-      <w:r>
-        <w:t>этот</w:t>
-      </w:r>
-      <w:proofErr w:type="spellEnd"/>
-      <w:r>
-        <w:t xml:space="preserve"> </w:t>
-      </w:r>
-      <w:proofErr w:type="spellStart"/>
-      <w:r>
-        <w:t>паспорт</w:t>
-      </w:r>
-      <w:proofErr w:type="spellEnd"/>
-      <w:r>
-        <w:t>.</w:t>
+      <w:r>
+        <w:t>этот паспорт.</w:t>
       </w:r>
     </w:p>
     <w:p>
@@ -5347,15 +4725,7 @@
         <w:pStyle w:val="31"/>
       </w:pPr>
       <w:r>
-        <w:t>7. Maintenance (</w:t>
-      </w:r>
-      <w:proofErr w:type="spellStart"/>
-      <w:r>
-        <w:t>сопровождение</w:t>
-      </w:r>
-      <w:proofErr w:type="spellEnd"/>
-      <w:r>
-        <w:t>)</w:t>
+        <w:t>7. Maintenance (сопровождение)</w:t>
       </w:r>
     </w:p>
     <w:p>
@@ -5396,19 +4766,9 @@
         </w:rPr>
         <w:t xml:space="preserve"> (удаление, исправление авторства) принимаются по адресу проекта. </w:t>
       </w:r>
-      <w:proofErr w:type="spellStart"/>
-      <w:r>
-        <w:t>Объект</w:t>
-      </w:r>
-      <w:proofErr w:type="spellEnd"/>
-      <w:r>
-        <w:t xml:space="preserve"> </w:t>
-      </w:r>
-      <w:proofErr w:type="spellStart"/>
-      <w:r>
-        <w:t>снимается</w:t>
-      </w:r>
-      <w:proofErr w:type="spellEnd"/>
+      <w:r>
+        <w:t>Объект снимается</w:t>
+      </w:r>
     </w:p>
     <w:p>
       <w:pPr>
@@ -5420,6 +4780,7 @@
         <w:rPr>
           <w:lang w:val="ru-RU"/>
         </w:rPr>
+        <w:lastRenderedPageBreak/>
         <w:t>с публикации до проверки, а манифест и номер версии набора обновляются.</w:t>
       </w:r>
     </w:p>
@@ -5430,21 +4791,12 @@
           <w:lang w:val="ru-RU"/>
         </w:rPr>
       </w:pPr>
-      <w:proofErr w:type="spellStart"/>
       <w:r>
         <w:rPr>
           <w:b/>
           <w:lang w:val="ru-RU"/>
         </w:rPr>
-        <w:t>Версионирование</w:t>
-      </w:r>
-      <w:proofErr w:type="spellEnd"/>
-      <w:r>
-        <w:rPr>
-          <w:b/>
-          <w:lang w:val="ru-RU"/>
-        </w:rPr>
-        <w:t>:</w:t>
+        <w:t>Версионирование:</w:t>
       </w:r>
       <w:r>
         <w:rPr>
@@ -5455,31 +4807,7 @@
     </w:p>
     <w:p>
       <w:r>
-        <w:t xml:space="preserve">с </w:t>
-      </w:r>
-      <w:proofErr w:type="spellStart"/>
-      <w:r>
-        <w:t>контрольной</w:t>
-      </w:r>
-      <w:proofErr w:type="spellEnd"/>
-      <w:r>
-        <w:t xml:space="preserve"> </w:t>
-      </w:r>
-      <w:proofErr w:type="spellStart"/>
-      <w:r>
-        <w:t>суммой</w:t>
-      </w:r>
-      <w:proofErr w:type="spellEnd"/>
-      <w:r>
-        <w:t xml:space="preserve"> </w:t>
-      </w:r>
-      <w:proofErr w:type="spellStart"/>
-      <w:r>
-        <w:t>манифеста</w:t>
-      </w:r>
-      <w:proofErr w:type="spellEnd"/>
-      <w:r>
-        <w:t>.</w:t>
+        <w:t>с контрольной суммой манифеста.</w:t>
       </w:r>
     </w:p>
     <w:p>
@@ -5549,21 +4877,8 @@
         <w:pStyle w:val="a0"/>
         <w:ind w:left="850"/>
       </w:pPr>
-      <w:proofErr w:type="spellStart"/>
-      <w:r>
-        <w:t>запросить</w:t>
-      </w:r>
-      <w:proofErr w:type="spellEnd"/>
-      <w:r>
-        <w:t xml:space="preserve"> </w:t>
-      </w:r>
-      <w:proofErr w:type="spellStart"/>
-      <w:r>
-        <w:t>дату</w:t>
-      </w:r>
-      <w:proofErr w:type="spellEnd"/>
-      <w:r>
-        <w:t xml:space="preserve"> item03;</w:t>
+      <w:r>
+        <w:t>запросить дату item03;</w:t>
       </w:r>
     </w:p>
     <w:p>
@@ -5596,21 +4911,7 @@
         <w:rPr>
           <w:lang w:val="ru-RU"/>
         </w:rPr>
-        <w:t xml:space="preserve">-2.0 на </w:t>
-      </w:r>
-      <w:proofErr w:type="spellStart"/>
-      <w:r>
-        <w:rPr>
-          <w:lang w:val="ru-RU"/>
-        </w:rPr>
-        <w:t>медиаобъектах</w:t>
-      </w:r>
-      <w:proofErr w:type="spellEnd"/>
-      <w:r>
-        <w:rPr>
-          <w:lang w:val="ru-RU"/>
-        </w:rPr>
-        <w:t>;</w:t>
+        <w:t>-2.0 на медиаобъектах;</w:t>
       </w:r>
     </w:p>
     <w:p>
@@ -5739,11 +5040,9 @@
         </w:rPr>
         <w:t>.</w:t>
       </w:r>
-      <w:proofErr w:type="spellStart"/>
       <w:r>
         <w:t>py</w:t>
       </w:r>
-      <w:proofErr w:type="spellEnd"/>
       <w:r>
         <w:rPr>
           <w:lang w:val="ru-RU"/>
@@ -5782,21 +5081,8 @@
       <w:pPr>
         <w:pStyle w:val="a0"/>
       </w:pPr>
-      <w:proofErr w:type="spellStart"/>
-      <w:r>
-        <w:t>Среда</w:t>
-      </w:r>
-      <w:proofErr w:type="spellEnd"/>
-      <w:r>
-        <w:t xml:space="preserve"> </w:t>
-      </w:r>
-      <w:proofErr w:type="spellStart"/>
-      <w:r>
-        <w:t>выполнения</w:t>
-      </w:r>
-      <w:proofErr w:type="spellEnd"/>
-      <w:r>
-        <w:t>: Python 3.14.2 (CPython), macOS-15.5-arm64-arm-64bit-Mach-O.</w:t>
+      <w:r>
+        <w:t>Среда выполнения: Python 3.14.2 (CPython), macOS-15.5-arm64-arm-64bit-Mach-O.</w:t>
       </w:r>
     </w:p>
     <w:p>
@@ -5818,15 +5104,7 @@
         <w:pStyle w:val="31"/>
       </w:pPr>
       <w:r>
-        <w:t>Intended Use (</w:t>
-      </w:r>
-      <w:proofErr w:type="spellStart"/>
-      <w:r>
-        <w:t>назначение</w:t>
-      </w:r>
-      <w:proofErr w:type="spellEnd"/>
-      <w:r>
-        <w:t>)</w:t>
+        <w:t>Intended Use (назначение)</w:t>
       </w:r>
     </w:p>
     <w:p>
@@ -5871,16 +5149,7 @@
         <w:pStyle w:val="31"/>
       </w:pPr>
       <w:r>
-        <w:lastRenderedPageBreak/>
-        <w:t>Factors (</w:t>
-      </w:r>
-      <w:proofErr w:type="spellStart"/>
-      <w:r>
-        <w:t>факторы</w:t>
-      </w:r>
-      <w:proofErr w:type="spellEnd"/>
-      <w:r>
-        <w:t>)</w:t>
+        <w:t>Factors (факторы)</w:t>
       </w:r>
     </w:p>
     <w:p>
@@ -5910,15 +5179,7 @@
         <w:pStyle w:val="31"/>
       </w:pPr>
       <w:r>
-        <w:t>Metrics (</w:t>
-      </w:r>
-      <w:proofErr w:type="spellStart"/>
-      <w:r>
-        <w:t>метрики</w:t>
-      </w:r>
-      <w:proofErr w:type="spellEnd"/>
-      <w:r>
-        <w:t>)</w:t>
+        <w:t>Metrics (метрики)</w:t>
       </w:r>
     </w:p>
     <w:p>
@@ -5969,19 +5230,11 @@
       <w:r>
         <w:t>Δ</w:t>
       </w:r>
-      <w:proofErr w:type="gramStart"/>
-      <w:r>
-        <w:rPr>
-          <w:lang w:val="ru-RU"/>
-        </w:rPr>
-        <w:t>| &gt;</w:t>
-      </w:r>
-      <w:proofErr w:type="gramEnd"/>
-      <w:r>
-        <w:rPr>
-          <w:lang w:val="ru-RU"/>
-        </w:rPr>
-        <w:t xml:space="preserve"> 2</w:t>
+      <w:r>
+        <w:rPr>
+          <w:lang w:val="ru-RU"/>
+        </w:rPr>
+        <w:t>| &gt; 2</w:t>
       </w:r>
       <w:r>
         <w:t>s</w:t>
@@ -6001,6 +5254,7 @@
         </w:rPr>
       </w:pPr>
       <w:r>
+        <w:lastRenderedPageBreak/>
         <w:t>Evaluation</w:t>
       </w:r>
       <w:r>
@@ -6047,23 +5301,7 @@
         <w:pStyle w:val="31"/>
       </w:pPr>
       <w:r>
-        <w:t>Training Data (</w:t>
-      </w:r>
-      <w:proofErr w:type="spellStart"/>
-      <w:r>
-        <w:t>обучающие</w:t>
-      </w:r>
-      <w:proofErr w:type="spellEnd"/>
-      <w:r>
-        <w:t xml:space="preserve"> </w:t>
-      </w:r>
-      <w:proofErr w:type="spellStart"/>
-      <w:r>
-        <w:t>данные</w:t>
-      </w:r>
-      <w:proofErr w:type="spellEnd"/>
-      <w:r>
-        <w:t>)</w:t>
+        <w:t>Training Data (обучающие данные)</w:t>
       </w:r>
     </w:p>
     <w:p>
@@ -6085,23 +5323,7 @@
         <w:pStyle w:val="31"/>
       </w:pPr>
       <w:r>
-        <w:t>Quantitative Analyses (</w:t>
-      </w:r>
-      <w:proofErr w:type="spellStart"/>
-      <w:r>
-        <w:t>количественный</w:t>
-      </w:r>
-      <w:proofErr w:type="spellEnd"/>
-      <w:r>
-        <w:t xml:space="preserve"> </w:t>
-      </w:r>
-      <w:proofErr w:type="spellStart"/>
-      <w:r>
-        <w:t>анализ</w:t>
-      </w:r>
-      <w:proofErr w:type="spellEnd"/>
-      <w:r>
-        <w:t>)</w:t>
+        <w:t>Quantitative Analyses (количественный анализ)</w:t>
       </w:r>
     </w:p>
     <w:tbl>
@@ -6356,23 +5578,7 @@
         <w:pStyle w:val="31"/>
       </w:pPr>
       <w:r>
-        <w:t>Ethical Considerations (</w:t>
-      </w:r>
-      <w:proofErr w:type="spellStart"/>
-      <w:r>
-        <w:t>этические</w:t>
-      </w:r>
-      <w:proofErr w:type="spellEnd"/>
-      <w:r>
-        <w:t xml:space="preserve"> </w:t>
-      </w:r>
-      <w:proofErr w:type="spellStart"/>
-      <w:r>
-        <w:t>аспекты</w:t>
-      </w:r>
-      <w:proofErr w:type="spellEnd"/>
-      <w:r>
-        <w:t>)</w:t>
+        <w:t>Ethical Considerations (этические аспекты)</w:t>
       </w:r>
     </w:p>
     <w:p>
@@ -6408,15 +5614,7 @@
         <w:pStyle w:val="31"/>
       </w:pPr>
       <w:r>
-        <w:t>Caveats and Recommendations (</w:t>
-      </w:r>
-      <w:proofErr w:type="spellStart"/>
-      <w:r>
-        <w:t>ограничения</w:t>
-      </w:r>
-      <w:proofErr w:type="spellEnd"/>
-      <w:r>
-        <w:t xml:space="preserve"> и рекомендации)</w:t>
+        <w:t>Caveats and Recommendations (ограничения и рекомендации)</w:t>
       </w:r>
     </w:p>
     <w:p>
@@ -6525,16 +5723,13 @@
             <w:shd w:val="clear" w:color="auto" w:fill="DCE3EE"/>
           </w:tcPr>
           <w:p>
-            <w:proofErr w:type="spellStart"/>
             <w:r>
               <w:rPr>
                 <w:b/>
                 <w:sz w:val="19"/>
               </w:rPr>
-              <w:lastRenderedPageBreak/>
               <w:t>Пробел</w:t>
             </w:r>
-            <w:proofErr w:type="spellEnd"/>
           </w:p>
         </w:tc>
         <w:tc>
@@ -6606,14 +5801,12 @@
             <w:tcW w:w="3324" w:type="dxa"/>
           </w:tcPr>
           <w:p>
-            <w:proofErr w:type="spellStart"/>
             <w:r>
               <w:rPr>
                 <w:sz w:val="19"/>
               </w:rPr>
               <w:t>студент</w:t>
             </w:r>
-            <w:proofErr w:type="spellEnd"/>
           </w:p>
         </w:tc>
       </w:tr>
@@ -6686,7 +5879,6 @@
               </w:rPr>
               <w:t>.</w:t>
             </w:r>
-            <w:proofErr w:type="spellStart"/>
             <w:r>
               <w:rPr>
                 <w:rFonts w:ascii="Courier New" w:eastAsia="Courier New" w:hAnsi="Courier New"/>
@@ -6694,7 +5886,6 @@
               </w:rPr>
               <w:t>py</w:t>
             </w:r>
-            <w:proofErr w:type="spellEnd"/>
             <w:r>
               <w:rPr>
                 <w:sz w:val="19"/>
@@ -6732,7 +5923,6 @@
               </w:rPr>
               <w:t>.</w:t>
             </w:r>
-            <w:proofErr w:type="spellStart"/>
             <w:r>
               <w:rPr>
                 <w:rFonts w:ascii="Courier New" w:eastAsia="Courier New" w:hAnsi="Courier New"/>
@@ -6740,7 +5930,6 @@
               </w:rPr>
               <w:t>py</w:t>
             </w:r>
-            <w:proofErr w:type="spellEnd"/>
             <w:r>
               <w:rPr>
                 <w:sz w:val="19"/>
@@ -6778,7 +5967,6 @@
               </w:rPr>
               <w:t>.</w:t>
             </w:r>
-            <w:proofErr w:type="spellStart"/>
             <w:r>
               <w:rPr>
                 <w:rFonts w:ascii="Courier New" w:eastAsia="Courier New" w:hAnsi="Courier New"/>
@@ -6786,7 +5974,6 @@
               </w:rPr>
               <w:t>py</w:t>
             </w:r>
-            <w:proofErr w:type="spellEnd"/>
             <w:r>
               <w:rPr>
                 <w:sz w:val="19"/>
@@ -6839,7 +6026,6 @@
               </w:rPr>
               <w:t>.</w:t>
             </w:r>
-            <w:proofErr w:type="spellStart"/>
             <w:r>
               <w:rPr>
                 <w:rFonts w:ascii="Courier New" w:eastAsia="Courier New" w:hAnsi="Courier New"/>
@@ -6847,13 +6033,20 @@
               </w:rPr>
               <w:t>py</w:t>
             </w:r>
-            <w:proofErr w:type="spellEnd"/>
             <w:r>
               <w:rPr>
                 <w:sz w:val="19"/>
                 <w:lang w:val="ru-RU"/>
               </w:rPr>
-              <w:t xml:space="preserve">) автор может выпустить под </w:t>
+              <w:t xml:space="preserve">) автор </w:t>
+            </w:r>
+            <w:r>
+              <w:rPr>
+                <w:sz w:val="19"/>
+                <w:lang w:val="ru-RU"/>
+              </w:rPr>
+              <w:lastRenderedPageBreak/>
+              <w:t xml:space="preserve">может выпустить под </w:t>
             </w:r>
             <w:r>
               <w:rPr>
@@ -6879,6 +6072,7 @@
               <w:rPr>
                 <w:sz w:val="19"/>
               </w:rPr>
+              <w:lastRenderedPageBreak/>
               <w:t>автор курса (преподаватель)</w:t>
             </w:r>
           </w:p>
@@ -6919,116 +6113,92 @@
                 <w:sz w:val="19"/>
                 <w:lang w:val="ru-RU"/>
               </w:rPr>
-              <w:t xml:space="preserve">Дополнено из ЛР 1: демо (вариант 1) воспроизведено </w:t>
-            </w:r>
-            <w:proofErr w:type="spellStart"/>
+              <w:t xml:space="preserve">Дополнено из ЛР 1: демо (вариант 1) воспроизведено побитово на </w:t>
+            </w:r>
+            <w:r>
+              <w:rPr>
+                <w:sz w:val="19"/>
+              </w:rPr>
+              <w:t>macOS</w:t>
+            </w:r>
             <w:r>
               <w:rPr>
                 <w:sz w:val="19"/>
                 <w:lang w:val="ru-RU"/>
               </w:rPr>
-              <w:t>побитово</w:t>
-            </w:r>
-            <w:proofErr w:type="spellEnd"/>
+              <w:t xml:space="preserve"> / </w:t>
+            </w:r>
+            <w:r>
+              <w:rPr>
+                <w:sz w:val="19"/>
+              </w:rPr>
+              <w:t>CPython</w:t>
+            </w:r>
             <w:r>
               <w:rPr>
                 <w:sz w:val="19"/>
                 <w:lang w:val="ru-RU"/>
               </w:rPr>
-              <w:t xml:space="preserve"> на </w:t>
-            </w:r>
-            <w:r>
-              <w:rPr>
-                <w:sz w:val="19"/>
-              </w:rPr>
-              <w:t>macOS</w:t>
+              <w:t xml:space="preserve"> 3.14.2 / </w:t>
+            </w:r>
+            <w:r>
+              <w:rPr>
+                <w:sz w:val="19"/>
+              </w:rPr>
+              <w:t>zlib</w:t>
             </w:r>
             <w:r>
               <w:rPr>
                 <w:sz w:val="19"/>
                 <w:lang w:val="ru-RU"/>
               </w:rPr>
+              <w:t xml:space="preserve"> 1.2.12. Совпали массивы, </w:t>
+            </w:r>
+            <w:r>
+              <w:rPr>
+                <w:sz w:val="19"/>
+              </w:rPr>
+              <w:t>PNG</w:t>
+            </w:r>
+            <w:r>
+              <w:rPr>
+                <w:sz w:val="19"/>
+                <w:lang w:val="ru-RU"/>
+              </w:rPr>
+              <w:t xml:space="preserve"> и метрики с результатами на </w:t>
+            </w:r>
+            <w:r>
+              <w:rPr>
+                <w:sz w:val="19"/>
+              </w:rPr>
+              <w:t>Windows</w:t>
+            </w:r>
+            <w:r>
+              <w:rPr>
+                <w:sz w:val="19"/>
+                <w:lang w:val="ru-RU"/>
+              </w:rPr>
               <w:t xml:space="preserve"> / </w:t>
             </w:r>
-            <w:proofErr w:type="spellStart"/>
             <w:r>
               <w:rPr>
                 <w:sz w:val="19"/>
               </w:rPr>
               <w:t>CPython</w:t>
             </w:r>
-            <w:proofErr w:type="spellEnd"/>
             <w:r>
               <w:rPr>
                 <w:sz w:val="19"/>
                 <w:lang w:val="ru-RU"/>
               </w:rPr>
-              <w:t xml:space="preserve"> 3.14.2 / </w:t>
-            </w:r>
-            <w:proofErr w:type="spellStart"/>
+              <w:t xml:space="preserve"> 3.13.7 / </w:t>
+            </w:r>
             <w:r>
               <w:rPr>
                 <w:sz w:val="19"/>
               </w:rPr>
               <w:t>zlib</w:t>
             </w:r>
-            <w:proofErr w:type="spellEnd"/>
-            <w:r>
-              <w:rPr>
-                <w:sz w:val="19"/>
-                <w:lang w:val="ru-RU"/>
-              </w:rPr>
-              <w:t xml:space="preserve"> 1.2.12. Совпали массивы, </w:t>
-            </w:r>
-            <w:r>
-              <w:rPr>
-                <w:sz w:val="19"/>
-              </w:rPr>
-              <w:t>PNG</w:t>
-            </w:r>
-            <w:r>
-              <w:rPr>
-                <w:sz w:val="19"/>
-                <w:lang w:val="ru-RU"/>
-              </w:rPr>
-              <w:t xml:space="preserve"> и метрики с результатами на </w:t>
-            </w:r>
-            <w:r>
-              <w:rPr>
-                <w:sz w:val="19"/>
-              </w:rPr>
-              <w:t>Windows</w:t>
-            </w:r>
-            <w:r>
-              <w:rPr>
-                <w:sz w:val="19"/>
-                <w:lang w:val="ru-RU"/>
-              </w:rPr>
-              <w:t xml:space="preserve"> / </w:t>
-            </w:r>
-            <w:proofErr w:type="spellStart"/>
-            <w:r>
-              <w:rPr>
-                <w:sz w:val="19"/>
-              </w:rPr>
-              <w:t>CPython</w:t>
-            </w:r>
-            <w:proofErr w:type="spellEnd"/>
-            <w:r>
-              <w:rPr>
-                <w:sz w:val="19"/>
-                <w:lang w:val="ru-RU"/>
-              </w:rPr>
-              <w:t xml:space="preserve"> 3.13.7 / </w:t>
-            </w:r>
-            <w:proofErr w:type="spellStart"/>
-            <w:r>
-              <w:rPr>
-                <w:sz w:val="19"/>
-              </w:rPr>
-              <w:t>zlib</w:t>
-            </w:r>
-            <w:proofErr w:type="spellEnd"/>
             <w:r>
               <w:rPr>
                 <w:sz w:val="19"/>
@@ -7043,14 +6213,12 @@
             <w:tcW w:w="3324" w:type="dxa"/>
           </w:tcPr>
           <w:p>
-            <w:proofErr w:type="spellStart"/>
             <w:r>
               <w:rPr>
                 <w:sz w:val="19"/>
               </w:rPr>
               <w:t>студент</w:t>
             </w:r>
-            <w:proofErr w:type="spellEnd"/>
           </w:p>
         </w:tc>
       </w:tr>
@@ -7116,7 +6284,6 @@
             <w:shd w:val="clear" w:color="auto" w:fill="DCE3EE"/>
           </w:tcPr>
           <w:p>
-            <w:proofErr w:type="spellStart"/>
             <w:r>
               <w:rPr>
                 <w:b/>
@@ -7124,7 +6291,6 @@
               </w:rPr>
               <w:t>Метрика</w:t>
             </w:r>
-            <w:proofErr w:type="spellEnd"/>
           </w:p>
         </w:tc>
         <w:tc>
@@ -7523,21 +6689,8 @@
           <w:lang w:val="ru-RU"/>
         </w:rPr>
       </w:pPr>
-      <w:proofErr w:type="spellStart"/>
-      <w:r>
-        <w:t>модели</w:t>
-      </w:r>
-      <w:proofErr w:type="spellEnd"/>
-      <w:r>
-        <w:t xml:space="preserve"> (</w:t>
-      </w:r>
-      <w:proofErr w:type="spellStart"/>
-      <w:r>
-        <w:t>группа</w:t>
-      </w:r>
-      <w:proofErr w:type="spellEnd"/>
-      <w:r>
-        <w:t xml:space="preserve"> Confabulation / Human-AI Configuration). </w:t>
+      <w:r>
+        <w:t xml:space="preserve">модели (группа Confabulation / Human-AI Configuration). </w:t>
       </w:r>
       <w:r>
         <w:rPr>
@@ -7575,7 +6728,6 @@
         <w:rPr>
           <w:lang w:val="ru-RU"/>
         </w:rPr>
-        <w:lastRenderedPageBreak/>
         <w:t>6.4. Реестр рисков</w:t>
       </w:r>
     </w:p>
@@ -7966,28 +7118,12 @@
             <w:tcW w:w="1425" w:type="dxa"/>
           </w:tcPr>
           <w:p>
-            <w:proofErr w:type="spellStart"/>
             <w:r>
               <w:rPr>
                 <w:sz w:val="17"/>
               </w:rPr>
-              <w:t>куратор</w:t>
-            </w:r>
-            <w:proofErr w:type="spellEnd"/>
-            <w:r>
-              <w:rPr>
-                <w:sz w:val="17"/>
-              </w:rPr>
-              <w:t xml:space="preserve"> </w:t>
-            </w:r>
-            <w:proofErr w:type="spellStart"/>
-            <w:r>
-              <w:rPr>
-                <w:sz w:val="17"/>
-              </w:rPr>
-              <w:t>набора</w:t>
-            </w:r>
-            <w:proofErr w:type="spellEnd"/>
+              <w:t>куратор набора</w:t>
+            </w:r>
           </w:p>
         </w:tc>
         <w:tc>
@@ -8078,7 +7214,15 @@
                 <w:sz w:val="17"/>
                 <w:lang w:val="ru-RU"/>
               </w:rPr>
-              <w:t xml:space="preserve">Объект опубликован под неверной лицензией или с неверным автором: </w:t>
+              <w:t xml:space="preserve">Объект опубликован под неверной </w:t>
+            </w:r>
+            <w:r>
+              <w:rPr>
+                <w:sz w:val="17"/>
+                <w:lang w:val="ru-RU"/>
+              </w:rPr>
+              <w:lastRenderedPageBreak/>
+              <w:t xml:space="preserve">лицензией или с неверным автором: </w:t>
             </w:r>
             <w:r>
               <w:rPr>
@@ -8175,7 +7319,16 @@
                 <w:sz w:val="17"/>
                 <w:lang w:val="ru-RU"/>
               </w:rPr>
-              <w:t xml:space="preserve">Сверка лицензии и автора с первоисточником до публикации; файл </w:t>
+              <w:lastRenderedPageBreak/>
+              <w:t xml:space="preserve">Сверка лицензии и автора с первоисточником </w:t>
+            </w:r>
+            <w:r>
+              <w:rPr>
+                <w:sz w:val="17"/>
+                <w:lang w:val="ru-RU"/>
+              </w:rPr>
+              <w:lastRenderedPageBreak/>
+              <w:t xml:space="preserve">до публикации; файл </w:t>
             </w:r>
             <w:r>
               <w:rPr>
@@ -8197,56 +7350,13 @@
             <w:tcW w:w="1425" w:type="dxa"/>
           </w:tcPr>
           <w:p>
-            <w:proofErr w:type="spellStart"/>
             <w:r>
               <w:rPr>
                 <w:sz w:val="17"/>
               </w:rPr>
-              <w:t>куратор</w:t>
-            </w:r>
-            <w:proofErr w:type="spellEnd"/>
-            <w:r>
-              <w:rPr>
-                <w:sz w:val="17"/>
-              </w:rPr>
-              <w:t xml:space="preserve"> </w:t>
-            </w:r>
-            <w:proofErr w:type="spellStart"/>
-            <w:r>
-              <w:rPr>
-                <w:sz w:val="17"/>
-              </w:rPr>
-              <w:t>набора</w:t>
-            </w:r>
-            <w:proofErr w:type="spellEnd"/>
-            <w:r>
-              <w:rPr>
-                <w:sz w:val="17"/>
-              </w:rPr>
-              <w:t xml:space="preserve">; </w:t>
-            </w:r>
-            <w:proofErr w:type="spellStart"/>
-            <w:r>
-              <w:rPr>
-                <w:sz w:val="17"/>
-              </w:rPr>
-              <w:t>юрист</w:t>
-            </w:r>
-            <w:proofErr w:type="spellEnd"/>
-            <w:r>
-              <w:rPr>
-                <w:sz w:val="17"/>
-              </w:rPr>
-              <w:t xml:space="preserve"> </w:t>
-            </w:r>
-            <w:proofErr w:type="spellStart"/>
-            <w:r>
-              <w:rPr>
-                <w:sz w:val="17"/>
-              </w:rPr>
-              <w:t>университета</w:t>
-            </w:r>
-            <w:proofErr w:type="spellEnd"/>
+              <w:lastRenderedPageBreak/>
+              <w:t>куратор набора; юрист университета</w:t>
+            </w:r>
           </w:p>
         </w:tc>
         <w:tc>
@@ -8264,7 +7374,15 @@
                 <w:sz w:val="17"/>
                 <w:lang w:val="ru-RU"/>
               </w:rPr>
-              <w:t>Обращение правообладателя или расхождение лицензии/автора между манифестом и первоисточником</w:t>
+              <w:t xml:space="preserve">Обращение правообладателя или расхождение </w:t>
+            </w:r>
+            <w:r>
+              <w:rPr>
+                <w:sz w:val="17"/>
+                <w:lang w:val="ru-RU"/>
+              </w:rPr>
+              <w:lastRenderedPageBreak/>
+              <w:t>лицензии/автора между манифестом и первоисточником</w:t>
             </w:r>
           </w:p>
         </w:tc>
@@ -8279,6 +7397,7 @@
               <w:rPr>
                 <w:sz w:val="17"/>
               </w:rPr>
+              <w:lastRenderedPageBreak/>
               <w:t>3</w:t>
             </w:r>
           </w:p>
@@ -8408,23 +7527,7 @@
                 <w:sz w:val="17"/>
                 <w:lang w:val="ru-RU"/>
               </w:rPr>
-              <w:t xml:space="preserve">-256 по фактическим файлам; публиковать </w:t>
-            </w:r>
-            <w:proofErr w:type="spellStart"/>
-            <w:r>
-              <w:rPr>
-                <w:sz w:val="17"/>
-                <w:lang w:val="ru-RU"/>
-              </w:rPr>
-              <w:t>хеши</w:t>
-            </w:r>
-            <w:proofErr w:type="spellEnd"/>
-            <w:r>
-              <w:rPr>
-                <w:sz w:val="17"/>
-                <w:lang w:val="ru-RU"/>
-              </w:rPr>
-              <w:t xml:space="preserve"> рядом с набором; проверять их при каждом выпуске</w:t>
+              <w:t>-256 по фактическим файлам; публиковать хеши рядом с набором; проверять их при каждом выпуске</w:t>
             </w:r>
           </w:p>
         </w:tc>
@@ -8433,28 +7536,12 @@
             <w:tcW w:w="1425" w:type="dxa"/>
           </w:tcPr>
           <w:p>
-            <w:proofErr w:type="spellStart"/>
             <w:r>
               <w:rPr>
                 <w:sz w:val="17"/>
               </w:rPr>
-              <w:t>администратор</w:t>
-            </w:r>
-            <w:proofErr w:type="spellEnd"/>
-            <w:r>
-              <w:rPr>
-                <w:sz w:val="17"/>
-              </w:rPr>
-              <w:t xml:space="preserve"> </w:t>
-            </w:r>
-            <w:proofErr w:type="spellStart"/>
-            <w:r>
-              <w:rPr>
-                <w:sz w:val="17"/>
-              </w:rPr>
-              <w:t>хранилища</w:t>
-            </w:r>
-            <w:proofErr w:type="spellEnd"/>
+              <w:t>администратор хранилища</w:t>
+            </w:r>
           </w:p>
         </w:tc>
         <w:tc>
@@ -8478,23 +7565,7 @@
                 <w:sz w:val="17"/>
                 <w:lang w:val="ru-RU"/>
               </w:rPr>
-              <w:t xml:space="preserve">-256 скачанного файла не совпадает с </w:t>
-            </w:r>
-            <w:proofErr w:type="spellStart"/>
-            <w:r>
-              <w:rPr>
-                <w:sz w:val="17"/>
-                <w:lang w:val="ru-RU"/>
-              </w:rPr>
-              <w:t>хешем</w:t>
-            </w:r>
-            <w:proofErr w:type="spellEnd"/>
-            <w:r>
-              <w:rPr>
-                <w:sz w:val="17"/>
-                <w:lang w:val="ru-RU"/>
-              </w:rPr>
-              <w:t xml:space="preserve"> в опубликованном манифесте</w:t>
+              <w:t>-256 скачанного файла не совпадает с хешем в опубликованном манифесте</w:t>
             </w:r>
           </w:p>
         </w:tc>
@@ -8586,7 +7657,6 @@
               <w:rPr>
                 <w:sz w:val="17"/>
               </w:rPr>
-              <w:lastRenderedPageBreak/>
               <w:t>no</w:t>
             </w:r>
             <w:r>
@@ -8613,7 +7683,6 @@
                 <w:sz w:val="17"/>
                 <w:lang w:val="ru-RU"/>
               </w:rPr>
-              <w:lastRenderedPageBreak/>
               <w:t>Ручная проверка содержимого аудио и текстов перед публикацией; при обнаружении — документ-согласие или исключение</w:t>
             </w:r>
           </w:p>
@@ -8818,28 +7887,12 @@
             <w:tcW w:w="1425" w:type="dxa"/>
           </w:tcPr>
           <w:p>
-            <w:proofErr w:type="spellStart"/>
             <w:r>
               <w:rPr>
                 <w:sz w:val="17"/>
               </w:rPr>
-              <w:t>преподаватель-составитель</w:t>
-            </w:r>
-            <w:proofErr w:type="spellEnd"/>
-            <w:r>
-              <w:rPr>
-                <w:sz w:val="17"/>
-              </w:rPr>
-              <w:t xml:space="preserve"> </w:t>
-            </w:r>
-            <w:proofErr w:type="spellStart"/>
-            <w:r>
-              <w:rPr>
-                <w:sz w:val="17"/>
-              </w:rPr>
-              <w:t>набора</w:t>
-            </w:r>
-            <w:proofErr w:type="spellEnd"/>
+              <w:t>преподаватель-составитель набора</w:t>
+            </w:r>
           </w:p>
         </w:tc>
         <w:tc>
@@ -8857,23 +7910,7 @@
                 <w:sz w:val="17"/>
                 <w:lang w:val="ru-RU"/>
               </w:rPr>
-              <w:t xml:space="preserve">Доля объектов из одного </w:t>
-            </w:r>
-            <w:proofErr w:type="gramStart"/>
-            <w:r>
-              <w:rPr>
-                <w:sz w:val="17"/>
-                <w:lang w:val="ru-RU"/>
-              </w:rPr>
-              <w:t>источника &gt;</w:t>
-            </w:r>
-            <w:proofErr w:type="gramEnd"/>
-            <w:r>
-              <w:rPr>
-                <w:sz w:val="17"/>
-                <w:lang w:val="ru-RU"/>
-              </w:rPr>
-              <w:t xml:space="preserve"> 50 % в разделе </w:t>
+              <w:t xml:space="preserve">Доля объектов из одного источника &gt; 50 % в разделе </w:t>
             </w:r>
             <w:r>
               <w:rPr>
@@ -8974,28 +8011,12 @@
             <w:tcW w:w="1425" w:type="dxa"/>
           </w:tcPr>
           <w:p>
-            <w:proofErr w:type="spellStart"/>
             <w:r>
               <w:rPr>
                 <w:sz w:val="17"/>
               </w:rPr>
-              <w:t>куратор</w:t>
-            </w:r>
-            <w:proofErr w:type="spellEnd"/>
-            <w:r>
-              <w:rPr>
-                <w:sz w:val="17"/>
-              </w:rPr>
-              <w:t xml:space="preserve"> </w:t>
-            </w:r>
-            <w:proofErr w:type="spellStart"/>
-            <w:r>
-              <w:rPr>
-                <w:sz w:val="17"/>
-              </w:rPr>
-              <w:t>набора</w:t>
-            </w:r>
-            <w:proofErr w:type="spellEnd"/>
+              <w:t>куратор набора</w:t>
+            </w:r>
           </w:p>
         </w:tc>
         <w:tc>
@@ -9036,6 +8057,7 @@
         <w:rPr>
           <w:lang w:val="ru-RU"/>
         </w:rPr>
+        <w:lastRenderedPageBreak/>
         <w:t xml:space="preserve">Связь с находками: </w:t>
       </w:r>
       <w:r>
@@ -9743,7 +8765,6 @@
         <w:rPr>
           <w:lang w:val="ru-RU"/>
         </w:rPr>
-        <w:lastRenderedPageBreak/>
         <w:t>7. Анализ: что скрипт не может проверить и где решение спорно</w:t>
       </w:r>
     </w:p>
@@ -9780,15 +8801,7 @@
         <w:t xml:space="preserve">Скрипт не проверяет, что лицензия действительно принадлежит объекту и что источник существует. </w:t>
       </w:r>
       <w:r>
-        <w:t xml:space="preserve">CC0 у item07 </w:t>
-      </w:r>
-      <w:proofErr w:type="spellStart"/>
-      <w:r>
-        <w:t>без</w:t>
-      </w:r>
-      <w:proofErr w:type="spellEnd"/>
-      <w:r>
-        <w:t xml:space="preserve"> источника формально проходит все правила.</w:t>
+        <w:t>CC0 у item07 без источника формально проходит все правила.</w:t>
       </w:r>
     </w:p>
     <w:p>
@@ -9798,19 +8811,11 @@
           <w:lang w:val="ru-RU"/>
         </w:rPr>
       </w:pPr>
-      <w:proofErr w:type="spellStart"/>
-      <w:r>
-        <w:rPr>
-          <w:lang w:val="ru-RU"/>
-        </w:rPr>
-        <w:t>Хеши</w:t>
-      </w:r>
-      <w:proofErr w:type="spellEnd"/>
-      <w:r>
-        <w:rPr>
-          <w:lang w:val="ru-RU"/>
-        </w:rPr>
-        <w:t xml:space="preserve"> в манифесте не сверяются с файлами, поэтому ошибочная контрольная сумма неотличима от настоящего дубликата.</w:t>
+      <w:r>
+        <w:rPr>
+          <w:lang w:val="ru-RU"/>
+        </w:rPr>
+        <w:t>Хеши в манифесте не сверяются с файлами, поэтому ошибочная контрольная сумма неотличима от настоящего дубликата.</w:t>
       </w:r>
     </w:p>
     <w:p>
@@ -9960,21 +8965,7 @@
         <w:rPr>
           <w:lang w:val="ru-RU"/>
         </w:rPr>
-        <w:t xml:space="preserve">), и настоящим дубликатом они быть не могут. Ошибочен, скорее всего, </w:t>
-      </w:r>
-      <w:proofErr w:type="spellStart"/>
-      <w:r>
-        <w:rPr>
-          <w:lang w:val="ru-RU"/>
-        </w:rPr>
-        <w:t>хеш</w:t>
-      </w:r>
-      <w:proofErr w:type="spellEnd"/>
-      <w:r>
-        <w:rPr>
-          <w:lang w:val="ru-RU"/>
-        </w:rPr>
-        <w:t xml:space="preserve"> одного из них, и неизвестно которого. Решение «удалить </w:t>
+        <w:t xml:space="preserve">), и настоящим дубликатом они быть не могут. Ошибочен, скорее всего, хеш одного из них, и неизвестно которого. Решение «удалить </w:t>
       </w:r>
       <w:r>
         <w:t>item</w:t>
@@ -10049,6 +9040,7 @@
           <w:b/>
           <w:lang w:val="ru-RU"/>
         </w:rPr>
+        <w:lastRenderedPageBreak/>
         <w:t xml:space="preserve">Лицензии ПО на медиафайлах. </w:t>
       </w:r>
       <w:r>
@@ -10194,21 +9186,7 @@
         <w:rPr>
           <w:lang w:val="ru-RU"/>
         </w:rPr>
-        <w:t xml:space="preserve">; совпадение </w:t>
-      </w:r>
-      <w:proofErr w:type="spellStart"/>
-      <w:r>
-        <w:rPr>
-          <w:lang w:val="ru-RU"/>
-        </w:rPr>
-        <w:t>хеша</w:t>
-      </w:r>
-      <w:proofErr w:type="spellEnd"/>
-      <w:r>
-        <w:rPr>
-          <w:lang w:val="ru-RU"/>
-        </w:rPr>
-        <w:t xml:space="preserve"> у файлов разных типов — отдельная ошибка «несогласованная контрольная сумма»;</w:t>
+        <w:t>; совпадение хеша у файлов разных типов — отдельная ошибка «несогласованная контрольная сумма»;</w:t>
       </w:r>
     </w:p>
     <w:p>
@@ -10293,21 +9271,7 @@
         <w:rPr>
           <w:lang w:val="ru-RU"/>
         </w:rPr>
-        <w:t xml:space="preserve">-2.0) на </w:t>
-      </w:r>
-      <w:proofErr w:type="spellStart"/>
-      <w:r>
-        <w:rPr>
-          <w:lang w:val="ru-RU"/>
-        </w:rPr>
-        <w:t>медиаобъекте</w:t>
-      </w:r>
-      <w:proofErr w:type="spellEnd"/>
-      <w:r>
-        <w:rPr>
-          <w:lang w:val="ru-RU"/>
-        </w:rPr>
-        <w:t xml:space="preserve"> — предупреждение «сверить с первоисточником»;</w:t>
+        <w:t>-2.0) на медиаобъекте — предупреждение «сверить с первоисточником»;</w:t>
       </w:r>
     </w:p>
     <w:p>
@@ -10385,11 +9349,9 @@
         </w:rPr>
         <w:t>.</w:t>
       </w:r>
-      <w:proofErr w:type="spellStart"/>
       <w:r>
         <w:t>py</w:t>
       </w:r>
-      <w:proofErr w:type="spellEnd"/>
       <w:r>
         <w:rPr>
           <w:lang w:val="ru-RU"/>
@@ -10422,11 +9384,9 @@
         </w:rPr>
         <w:t>.</w:t>
       </w:r>
-      <w:proofErr w:type="spellStart"/>
       <w:r>
         <w:t>py</w:t>
       </w:r>
-      <w:proofErr w:type="spellEnd"/>
       <w:r>
         <w:rPr>
           <w:lang w:val="ru-RU"/>
@@ -10518,7 +9478,6 @@
         <w:rPr>
           <w:lang w:val="ru-RU"/>
         </w:rPr>
-        <w:lastRenderedPageBreak/>
         <w:t xml:space="preserve">сверить лицензию и автора каждого объекта по первоисточнику (страница архива </w:t>
       </w:r>
       <w:r>
@@ -10669,21 +9628,7 @@
         <w:rPr>
           <w:lang w:val="ru-RU"/>
         </w:rPr>
-        <w:t xml:space="preserve">02 можно счесть излишне строгим: лицензии у обоих в порядке. Но публикуемый набор с </w:t>
-      </w:r>
-      <w:proofErr w:type="spellStart"/>
-      <w:r>
-        <w:rPr>
-          <w:lang w:val="ru-RU"/>
-        </w:rPr>
-        <w:t>хешами</w:t>
-      </w:r>
-      <w:proofErr w:type="spellEnd"/>
-      <w:r>
-        <w:rPr>
-          <w:lang w:val="ru-RU"/>
-        </w:rPr>
-        <w:t xml:space="preserve">, которые не соответствуют файлам, нарушает собственную проверку целостности (риск </w:t>
+        <w:t xml:space="preserve">02 можно счесть излишне строгим: лицензии у обоих в порядке. Но публикуемый набор с хешами, которые не соответствуют файлам, нарушает собственную проверку целостности (риск </w:t>
       </w:r>
       <w:r>
         <w:t>R</w:t>
@@ -10796,43 +9741,14 @@
           <w:b/>
           <w:lang w:val="ru-RU"/>
         </w:rPr>
-        <w:t xml:space="preserve">Решено </w:t>
-      </w:r>
-      <w:proofErr w:type="spellStart"/>
-      <w:r>
-        <w:rPr>
-          <w:b/>
-          <w:lang w:val="ru-RU"/>
-        </w:rPr>
-        <w:t>инженерно</w:t>
-      </w:r>
-      <w:proofErr w:type="spellEnd"/>
-      <w:r>
-        <w:rPr>
-          <w:b/>
-          <w:lang w:val="ru-RU"/>
-        </w:rPr>
-        <w:t xml:space="preserve">: </w:t>
-      </w:r>
-      <w:r>
-        <w:rPr>
-          <w:lang w:val="ru-RU"/>
-        </w:rPr>
-        <w:t xml:space="preserve">карантин, пересчёт </w:t>
-      </w:r>
-      <w:proofErr w:type="spellStart"/>
-      <w:r>
-        <w:rPr>
-          <w:lang w:val="ru-RU"/>
-        </w:rPr>
-        <w:t>хешей</w:t>
-      </w:r>
-      <w:proofErr w:type="spellEnd"/>
-      <w:r>
-        <w:rPr>
-          <w:lang w:val="ru-RU"/>
-        </w:rPr>
-        <w:t xml:space="preserve">, пометка неизвестных значений вместо догадок, файл </w:t>
+        <w:lastRenderedPageBreak/>
+        <w:t xml:space="preserve">Решено инженерно: </w:t>
+      </w:r>
+      <w:r>
+        <w:rPr>
+          <w:lang w:val="ru-RU"/>
+        </w:rPr>
+        <w:t xml:space="preserve">карантин, пересчёт хешей, пометка неизвестных значений вместо догадок, файл </w:t>
       </w:r>
       <w:r>
         <w:t>ATTRIBUTION</w:t>
@@ -10953,9 +9869,6 @@
     <w:p>
       <w:pPr>
         <w:pStyle w:val="1"/>
-        <w:rPr>
-          <w:lang w:val="ru-RU"/>
-        </w:rPr>
       </w:pPr>
       <w:r>
         <w:rPr>
@@ -10965,84 +9878,164 @@
       </w:r>
     </w:p>
     <w:p>
-      <w:proofErr w:type="spellStart"/>
+      <w:pPr>
+        <w:rPr>
+          <w:lang w:val="ru-RU"/>
+        </w:rPr>
+      </w:pPr>
       <w:r>
         <w:rPr>
           <w:b/>
-        </w:rPr>
-        <w:t>Основные</w:t>
-      </w:r>
-      <w:proofErr w:type="spellEnd"/>
-      <w:r>
-        <w:rPr>
-          <w:b/>
-        </w:rPr>
+          <w:lang w:val="ru-RU"/>
+        </w:rPr>
+        <w:t>Папка с артефактами (Я.Диск):</w:t>
+      </w:r>
+      <w:r>
         <w:t xml:space="preserve"> </w:t>
       </w:r>
-      <w:proofErr w:type="spellStart"/>
-      <w:r>
-        <w:rPr>
-          <w:b/>
-        </w:rPr>
-        <w:t>файлы</w:t>
-      </w:r>
-      <w:proofErr w:type="spellEnd"/>
-      <w:r>
-        <w:rPr>
-          <w:b/>
-        </w:rPr>
-        <w:t xml:space="preserve">: </w:t>
-      </w:r>
-      <w:r>
-        <w:t>reports/journal.md, reports/decisions.md, artifacts/v18/data_card.md, artifacts/model_card.md, artifacts/risk_register.csv, artifacts/risk_ranking.md.</w:t>
-      </w:r>
+      <w:hyperlink r:id="rId6" w:history="1">
+        <w:r>
+          <w:rPr>
+            <w:rStyle w:val="aff8"/>
+          </w:rPr>
+          <w:t>https</w:t>
+        </w:r>
+        <w:r>
+          <w:rPr>
+            <w:rStyle w:val="aff8"/>
+            <w:lang w:val="ru-RU"/>
+          </w:rPr>
+          <w:t>://</w:t>
+        </w:r>
+        <w:r>
+          <w:rPr>
+            <w:rStyle w:val="aff8"/>
+          </w:rPr>
+          <w:t>disk</w:t>
+        </w:r>
+        <w:r>
+          <w:rPr>
+            <w:rStyle w:val="aff8"/>
+            <w:lang w:val="ru-RU"/>
+          </w:rPr>
+          <w:t>.</w:t>
+        </w:r>
+        <w:r>
+          <w:rPr>
+            <w:rStyle w:val="aff8"/>
+          </w:rPr>
+          <w:t>yandex</w:t>
+        </w:r>
+        <w:r>
+          <w:rPr>
+            <w:rStyle w:val="aff8"/>
+            <w:lang w:val="ru-RU"/>
+          </w:rPr>
+          <w:t>.</w:t>
+        </w:r>
+        <w:r>
+          <w:rPr>
+            <w:rStyle w:val="aff8"/>
+          </w:rPr>
+          <w:t>ru</w:t>
+        </w:r>
+        <w:r>
+          <w:rPr>
+            <w:rStyle w:val="aff8"/>
+            <w:lang w:val="ru-RU"/>
+          </w:rPr>
+          <w:t>/</w:t>
+        </w:r>
+        <w:r>
+          <w:rPr>
+            <w:rStyle w:val="aff8"/>
+          </w:rPr>
+          <w:t>d</w:t>
+        </w:r>
+        <w:r>
+          <w:rPr>
+            <w:rStyle w:val="aff8"/>
+            <w:lang w:val="ru-RU"/>
+          </w:rPr>
+          <w:t>/</w:t>
+        </w:r>
+        <w:r>
+          <w:rPr>
+            <w:rStyle w:val="aff8"/>
+          </w:rPr>
+          <w:t>Asv</w:t>
+        </w:r>
+        <w:r>
+          <w:rPr>
+            <w:rStyle w:val="aff8"/>
+            <w:lang w:val="ru-RU"/>
+          </w:rPr>
+          <w:t>5</w:t>
+        </w:r>
+        <w:r>
+          <w:rPr>
+            <w:rStyle w:val="aff8"/>
+          </w:rPr>
+          <w:t>aseXXJGb</w:t>
+        </w:r>
+        <w:r>
+          <w:rPr>
+            <w:rStyle w:val="aff8"/>
+            <w:lang w:val="ru-RU"/>
+          </w:rPr>
+          <w:t>4</w:t>
+        </w:r>
+        <w:r>
+          <w:rPr>
+            <w:rStyle w:val="aff8"/>
+          </w:rPr>
+          <w:t>Q</w:t>
+        </w:r>
+      </w:hyperlink>
     </w:p>
     <w:p>
-      <w:pPr>
-        <w:rPr>
-          <w:lang w:val="ru-RU"/>
-        </w:rPr>
-      </w:pPr>
       <w:r>
         <w:rPr>
           <w:b/>
-          <w:lang w:val="ru-RU"/>
-        </w:rPr>
-        <w:t xml:space="preserve">Индивидуальный вклад: </w:t>
-      </w:r>
-      <w:r>
-        <w:rPr>
-          <w:lang w:val="ru-RU"/>
-        </w:rPr>
-        <w:t>работа выполнена индивидуально.</w:t>
+        </w:rPr>
+        <w:t xml:space="preserve">Основные файлы: </w:t>
+      </w:r>
+      <w:r>
+        <w:t>reports/journal.md, reports/decisions.md, artifacts/v18/data_card.md, artifacts/model_card.md, artifacts/risk_register.csv, artifacts/risk_ranking.md.</w:t>
       </w:r>
     </w:p>
     <w:p>
       <w:pPr>
-        <w:pStyle w:val="1"/>
-        <w:rPr>
-          <w:lang w:val="ru-RU"/>
-        </w:rPr>
-      </w:pPr>
-      <w:r>
-        <w:rPr>
-          <w:lang w:val="ru-RU"/>
-        </w:rPr>
-        <w:t>Приложение. Ответы на контрольные вопросы</w:t>
+        <w:rPr>
+          <w:lang w:val="ru-RU"/>
+        </w:rPr>
+      </w:pPr>
+      <w:r>
+        <w:rPr>
+          <w:b/>
+          <w:lang w:val="ru-RU"/>
+        </w:rPr>
+        <w:t xml:space="preserve">Индивидуальный вклад: </w:t>
+      </w:r>
+      <w:r>
+        <w:rPr>
+          <w:lang w:val="ru-RU"/>
+        </w:rPr>
+        <w:t>работа выполнена индивидуально.</w:t>
       </w:r>
     </w:p>
     <w:p>
       <w:pPr>
-        <w:rPr>
-          <w:lang w:val="ru-RU"/>
-        </w:rPr>
-      </w:pPr>
-      <w:r>
-        <w:rPr>
-          <w:b/>
-          <w:lang w:val="ru-RU"/>
-        </w:rPr>
-        <w:t>1. Чем лицензия на входные данные отличается от лицензии на веса модели и от прав на результат?</w:t>
+        <w:pStyle w:val="1"/>
+        <w:rPr>
+          <w:lang w:val="ru-RU"/>
+        </w:rPr>
+      </w:pPr>
+      <w:r>
+        <w:rPr>
+          <w:lang w:val="ru-RU"/>
+        </w:rPr>
+        <w:t>Приложение. Ответы на контрольные вопросы</w:t>
       </w:r>
     </w:p>
     <w:p>
@@ -11053,64 +10046,10 @@
       </w:pPr>
       <w:r>
         <w:rPr>
-          <w:lang w:val="ru-RU"/>
-        </w:rPr>
-        <w:lastRenderedPageBreak/>
-        <w:t xml:space="preserve">Лицензия на данные определяет, что можно делать с исходными материалами. Лицензия на веса — что можно делать с моделью (например, у </w:t>
-      </w:r>
-      <w:r>
-        <w:t>SD</w:t>
-      </w:r>
-      <w:r>
-        <w:rPr>
-          <w:lang w:val="ru-RU"/>
-        </w:rPr>
-        <w:t>-</w:t>
-      </w:r>
-      <w:r>
-        <w:t>Turbo</w:t>
-      </w:r>
-      <w:r>
-        <w:rPr>
-          <w:lang w:val="ru-RU"/>
-        </w:rPr>
-        <w:t xml:space="preserve"> из ЛР 5 есть собственные условия </w:t>
-      </w:r>
-      <w:r>
-        <w:t>Stability</w:t>
-      </w:r>
-      <w:r>
-        <w:rPr>
-          <w:lang w:val="ru-RU"/>
-        </w:rPr>
-        <w:t xml:space="preserve"> </w:t>
-      </w:r>
-      <w:r>
-        <w:t>AI</w:t>
-      </w:r>
-      <w:r>
-        <w:rPr>
-          <w:lang w:val="ru-RU"/>
-        </w:rPr>
-        <w:t xml:space="preserve">). Права на результат определяются нормами и условиями сервиса. Ошибка смешения: «данные под </w:t>
-      </w:r>
-      <w:r>
-        <w:t>CC</w:t>
-      </w:r>
-      <w:r>
-        <w:rPr>
-          <w:lang w:val="ru-RU"/>
-        </w:rPr>
-        <w:t>-</w:t>
-      </w:r>
-      <w:r>
-        <w:t>BY</w:t>
-      </w:r>
-      <w:r>
-        <w:rPr>
-          <w:lang w:val="ru-RU"/>
-        </w:rPr>
-        <w:t>, значит, сгенерированные изображения можно продавать без указания авторов» — а условия весов при этом могут запрещать коммерческое использование.</w:t>
+          <w:b/>
+          <w:lang w:val="ru-RU"/>
+        </w:rPr>
+        <w:t>1. Чем лицензия на входные данные отличается от лицензии на веса модели и от прав на результат?</w:t>
       </w:r>
     </w:p>
     <w:p>
@@ -11121,62 +10060,63 @@
       </w:pPr>
       <w:r>
         <w:rPr>
-          <w:b/>
-          <w:lang w:val="ru-RU"/>
-        </w:rPr>
-        <w:t xml:space="preserve">2. Что означают условия </w:t>
-      </w:r>
-      <w:r>
-        <w:rPr>
-          <w:b/>
-        </w:rPr>
+          <w:lang w:val="ru-RU"/>
+        </w:rPr>
+        <w:t xml:space="preserve">Лицензия на данные определяет, что можно делать с исходными материалами. Лицензия на веса — что можно делать с моделью (например, у </w:t>
+      </w:r>
+      <w:r>
+        <w:t>SD</w:t>
+      </w:r>
+      <w:r>
+        <w:rPr>
+          <w:lang w:val="ru-RU"/>
+        </w:rPr>
+        <w:t>-</w:t>
+      </w:r>
+      <w:r>
+        <w:t>Turbo</w:t>
+      </w:r>
+      <w:r>
+        <w:rPr>
+          <w:lang w:val="ru-RU"/>
+        </w:rPr>
+        <w:t xml:space="preserve"> из ЛР 5 есть собственные условия </w:t>
+      </w:r>
+      <w:r>
+        <w:t>Stability</w:t>
+      </w:r>
+      <w:r>
+        <w:rPr>
+          <w:lang w:val="ru-RU"/>
+        </w:rPr>
+        <w:t xml:space="preserve"> </w:t>
+      </w:r>
+      <w:r>
+        <w:t>AI</w:t>
+      </w:r>
+      <w:r>
+        <w:rPr>
+          <w:lang w:val="ru-RU"/>
+        </w:rPr>
+        <w:t xml:space="preserve">). Права на результат определяются нормами и условиями сервиса. Ошибка смешения: «данные под </w:t>
+      </w:r>
+      <w:r>
+        <w:t>CC</w:t>
+      </w:r>
+      <w:r>
+        <w:rPr>
+          <w:lang w:val="ru-RU"/>
+        </w:rPr>
+        <w:t>-</w:t>
+      </w:r>
+      <w:r>
         <w:t>BY</w:t>
       </w:r>
       <w:r>
         <w:rPr>
-          <w:b/>
-          <w:lang w:val="ru-RU"/>
-        </w:rPr>
-        <w:t xml:space="preserve">, </w:t>
-      </w:r>
-      <w:r>
-        <w:rPr>
-          <w:b/>
-        </w:rPr>
-        <w:t>SA</w:t>
-      </w:r>
-      <w:r>
-        <w:rPr>
-          <w:b/>
-          <w:lang w:val="ru-RU"/>
-        </w:rPr>
-        <w:t xml:space="preserve">, </w:t>
-      </w:r>
-      <w:r>
-        <w:rPr>
-          <w:b/>
-        </w:rPr>
-        <w:t>NC</w:t>
-      </w:r>
-      <w:r>
-        <w:rPr>
-          <w:b/>
-          <w:lang w:val="ru-RU"/>
-        </w:rPr>
-        <w:t xml:space="preserve"> и </w:t>
-      </w:r>
-      <w:r>
-        <w:rPr>
-          <w:b/>
-        </w:rPr>
-        <w:t>ND</w:t>
-      </w:r>
-      <w:r>
-        <w:rPr>
-          <w:b/>
-          <w:lang w:val="ru-RU"/>
-        </w:rPr>
-        <w:t>? Какое из них создаёт конфликт со сценарием коммерческой афиши?</w:t>
+          <w:lang w:val="ru-RU"/>
+        </w:rPr>
+        <w:t>, значит, сгенерированные изображения можно продавать без указания авторов» — а условия весов при этом могут запрещать коммерческое использование.</w:t>
       </w:r>
     </w:p>
     <w:p>
@@ -11186,94 +10126,63 @@
         </w:rPr>
       </w:pPr>
       <w:r>
+        <w:rPr>
+          <w:b/>
+          <w:lang w:val="ru-RU"/>
+        </w:rPr>
+        <w:t xml:space="preserve">2. Что означают условия </w:t>
+      </w:r>
+      <w:r>
+        <w:rPr>
+          <w:b/>
+        </w:rPr>
         <w:t>BY</w:t>
       </w:r>
       <w:r>
         <w:rPr>
-          <w:lang w:val="ru-RU"/>
-        </w:rPr>
-        <w:t xml:space="preserve"> — указать автора; </w:t>
-      </w:r>
-      <w:r>
+          <w:b/>
+          <w:lang w:val="ru-RU"/>
+        </w:rPr>
+        <w:t xml:space="preserve">, </w:t>
+      </w:r>
+      <w:r>
+        <w:rPr>
+          <w:b/>
+        </w:rPr>
         <w:t>SA</w:t>
       </w:r>
       <w:r>
         <w:rPr>
-          <w:lang w:val="ru-RU"/>
-        </w:rPr>
-        <w:t xml:space="preserve"> — распространять адаптации на тех же условиях; </w:t>
-      </w:r>
-      <w:r>
+          <w:b/>
+          <w:lang w:val="ru-RU"/>
+        </w:rPr>
+        <w:t xml:space="preserve">, </w:t>
+      </w:r>
+      <w:r>
+        <w:rPr>
+          <w:b/>
+        </w:rPr>
         <w:t>NC</w:t>
       </w:r>
       <w:r>
         <w:rPr>
-          <w:lang w:val="ru-RU"/>
-        </w:rPr>
-        <w:t xml:space="preserve"> — только некоммерческое использование; </w:t>
-      </w:r>
-      <w:r>
+          <w:b/>
+          <w:lang w:val="ru-RU"/>
+        </w:rPr>
+        <w:t xml:space="preserve"> и </w:t>
+      </w:r>
+      <w:r>
+        <w:rPr>
+          <w:b/>
+        </w:rPr>
         <w:t>ND</w:t>
       </w:r>
       <w:r>
         <w:rPr>
-          <w:lang w:val="ru-RU"/>
-        </w:rPr>
-        <w:t xml:space="preserve"> — без производных. С коммерческой афишей конфликтует </w:t>
-      </w:r>
-      <w:r>
-        <w:t>NC</w:t>
-      </w:r>
-      <w:r>
-        <w:rPr>
-          <w:lang w:val="ru-RU"/>
-        </w:rPr>
-        <w:t xml:space="preserve"> (ошибка </w:t>
-      </w:r>
-      <w:r>
-        <w:t>R</w:t>
-      </w:r>
-      <w:r>
-        <w:rPr>
-          <w:lang w:val="ru-RU"/>
-        </w:rPr>
-        <w:t xml:space="preserve">3), а также </w:t>
-      </w:r>
-      <w:r>
-        <w:t>ND</w:t>
-      </w:r>
-      <w:r>
-        <w:rPr>
-          <w:lang w:val="ru-RU"/>
-        </w:rPr>
-        <w:t>, поскольку афиша — производная (</w:t>
-      </w:r>
-      <w:r>
-        <w:t>R</w:t>
-      </w:r>
-      <w:r>
-        <w:rPr>
-          <w:lang w:val="ru-RU"/>
-        </w:rPr>
-        <w:t xml:space="preserve">4). </w:t>
-      </w:r>
-      <w:r>
-        <w:t>SA</w:t>
-      </w:r>
-      <w:r>
-        <w:rPr>
-          <w:lang w:val="ru-RU"/>
-        </w:rPr>
-        <w:t xml:space="preserve"> даёт предупреждение </w:t>
-      </w:r>
-      <w:r>
-        <w:t>R</w:t>
-      </w:r>
-      <w:r>
-        <w:rPr>
-          <w:lang w:val="ru-RU"/>
-        </w:rPr>
-        <w:t>5, потому что в этом сценарии передача на тех же условиях недопустима.</w:t>
+          <w:b/>
+          <w:lang w:val="ru-RU"/>
+        </w:rPr>
+        <w:t>? Какое из них создаёт конфликт со сценарием коммерческой афиши?</w:t>
       </w:r>
     </w:p>
     <w:p>
@@ -11283,37 +10192,94 @@
         </w:rPr>
       </w:pPr>
       <w:r>
-        <w:rPr>
-          <w:b/>
-          <w:lang w:val="ru-RU"/>
-        </w:rPr>
-        <w:t>3. Почему запись «</w:t>
-      </w:r>
-      <w:r>
-        <w:rPr>
-          <w:b/>
-        </w:rPr>
-        <w:t>CC</w:t>
-      </w:r>
-      <w:r>
-        <w:rPr>
-          <w:b/>
-          <w:lang w:val="ru-RU"/>
-        </w:rPr>
-        <w:t xml:space="preserve"> </w:t>
-      </w:r>
-      <w:r>
-        <w:rPr>
-          <w:b/>
-        </w:rPr>
         <w:t>BY</w:t>
       </w:r>
       <w:r>
         <w:rPr>
-          <w:b/>
-          <w:lang w:val="ru-RU"/>
-        </w:rPr>
-        <w:t xml:space="preserve"> 4» нельзя принять как лицензию без уточнения?</w:t>
+          <w:lang w:val="ru-RU"/>
+        </w:rPr>
+        <w:t xml:space="preserve"> — указать автора; </w:t>
+      </w:r>
+      <w:r>
+        <w:t>SA</w:t>
+      </w:r>
+      <w:r>
+        <w:rPr>
+          <w:lang w:val="ru-RU"/>
+        </w:rPr>
+        <w:t xml:space="preserve"> — распространять адаптации на тех же условиях; </w:t>
+      </w:r>
+      <w:r>
+        <w:t>NC</w:t>
+      </w:r>
+      <w:r>
+        <w:rPr>
+          <w:lang w:val="ru-RU"/>
+        </w:rPr>
+        <w:t xml:space="preserve"> — только некоммерческое использование; </w:t>
+      </w:r>
+      <w:r>
+        <w:t>ND</w:t>
+      </w:r>
+      <w:r>
+        <w:rPr>
+          <w:lang w:val="ru-RU"/>
+        </w:rPr>
+        <w:t xml:space="preserve"> — без производных. С коммерческой афишей конфликтует </w:t>
+      </w:r>
+      <w:r>
+        <w:t>NC</w:t>
+      </w:r>
+      <w:r>
+        <w:rPr>
+          <w:lang w:val="ru-RU"/>
+        </w:rPr>
+        <w:t xml:space="preserve"> (ошибка </w:t>
+      </w:r>
+      <w:r>
+        <w:t>R</w:t>
+      </w:r>
+      <w:r>
+        <w:rPr>
+          <w:lang w:val="ru-RU"/>
+        </w:rPr>
+        <w:t xml:space="preserve">3), а также </w:t>
+      </w:r>
+      <w:r>
+        <w:t>ND</w:t>
+      </w:r>
+      <w:r>
+        <w:rPr>
+          <w:lang w:val="ru-RU"/>
+        </w:rPr>
+        <w:t>, поскольку афиша — производная (</w:t>
+      </w:r>
+      <w:r>
+        <w:t>R</w:t>
+      </w:r>
+      <w:r>
+        <w:rPr>
+          <w:lang w:val="ru-RU"/>
+        </w:rPr>
+        <w:t xml:space="preserve">4). </w:t>
+      </w:r>
+      <w:r>
+        <w:t>SA</w:t>
+      </w:r>
+      <w:r>
+        <w:rPr>
+          <w:lang w:val="ru-RU"/>
+        </w:rPr>
+        <w:t xml:space="preserve"> даёт предупреждение </w:t>
+      </w:r>
+      <w:r>
+        <w:t>R</w:t>
+      </w:r>
+      <w:r>
+        <w:rPr>
+          <w:lang w:val="ru-RU"/>
+        </w:rPr>
+        <w:t>5, потому что в этом сценарии передача на тех же условиях недопустима.</w:t>
       </w:r>
     </w:p>
     <w:p>
@@ -11324,63 +10290,36 @@
       </w:pPr>
       <w:r>
         <w:rPr>
-          <w:lang w:val="ru-RU"/>
-        </w:rPr>
-        <w:t xml:space="preserve">Это не идентификатор </w:t>
-      </w:r>
-      <w:r>
-        <w:t>SPDX</w:t>
-      </w:r>
-      <w:r>
-        <w:rPr>
-          <w:lang w:val="ru-RU"/>
-        </w:rPr>
-        <w:t>: непонятны версия (4.0?), вариант (</w:t>
-      </w:r>
-      <w:r>
+          <w:b/>
+          <w:lang w:val="ru-RU"/>
+        </w:rPr>
+        <w:t>3. Почему запись «</w:t>
+      </w:r>
+      <w:r>
+        <w:rPr>
+          <w:b/>
+        </w:rPr>
+        <w:t>CC</w:t>
+      </w:r>
+      <w:r>
+        <w:rPr>
+          <w:b/>
+          <w:lang w:val="ru-RU"/>
+        </w:rPr>
+        <w:t xml:space="preserve"> </w:t>
+      </w:r>
+      <w:r>
+        <w:rPr>
+          <w:b/>
+        </w:rPr>
         <w:t>BY</w:t>
       </w:r>
       <w:r>
         <w:rPr>
-          <w:lang w:val="ru-RU"/>
-        </w:rPr>
-        <w:t xml:space="preserve"> или </w:t>
-      </w:r>
-      <w:r>
-        <w:t>BY</w:t>
-      </w:r>
-      <w:r>
-        <w:rPr>
-          <w:lang w:val="ru-RU"/>
-        </w:rPr>
-        <w:t>-</w:t>
-      </w:r>
-      <w:r>
-        <w:t>SA</w:t>
-      </w:r>
-      <w:r>
-        <w:rPr>
-          <w:lang w:val="ru-RU"/>
-        </w:rPr>
-        <w:t xml:space="preserve">?) и даже то, проверял ли кто-то лицензию. Исправить по догадке нельзя — нужно подтверждение по первоисточнику. Корректно: </w:t>
-      </w:r>
-      <w:r>
-        <w:t>CC</w:t>
-      </w:r>
-      <w:r>
-        <w:rPr>
-          <w:lang w:val="ru-RU"/>
-        </w:rPr>
-        <w:t>-</w:t>
-      </w:r>
-      <w:r>
-        <w:t>BY</w:t>
-      </w:r>
-      <w:r>
-        <w:rPr>
-          <w:lang w:val="ru-RU"/>
-        </w:rPr>
-        <w:t>-4.0.</w:t>
+          <w:b/>
+          <w:lang w:val="ru-RU"/>
+        </w:rPr>
+        <w:t xml:space="preserve"> 4» нельзя принять как лицензию без уточнения?</w:t>
       </w:r>
     </w:p>
     <w:p>
@@ -11391,62 +10330,63 @@
       </w:pPr>
       <w:r>
         <w:rPr>
-          <w:b/>
-          <w:lang w:val="ru-RU"/>
-        </w:rPr>
-        <w:t xml:space="preserve">4. Почему в демо два объекта с </w:t>
-      </w:r>
-      <w:r>
-        <w:rPr>
-          <w:b/>
-        </w:rPr>
+          <w:lang w:val="ru-RU"/>
+        </w:rPr>
+        <w:t xml:space="preserve">Это не идентификатор </w:t>
+      </w:r>
+      <w:r>
+        <w:t>SPDX</w:t>
+      </w:r>
+      <w:r>
+        <w:rPr>
+          <w:lang w:val="ru-RU"/>
+        </w:rPr>
+        <w:t>: непонятны версия (4.0?), вариант (</w:t>
+      </w:r>
+      <w:r>
+        <w:t>BY</w:t>
+      </w:r>
+      <w:r>
+        <w:rPr>
+          <w:lang w:val="ru-RU"/>
+        </w:rPr>
+        <w:t xml:space="preserve"> или </w:t>
+      </w:r>
+      <w:r>
+        <w:t>BY</w:t>
+      </w:r>
+      <w:r>
+        <w:rPr>
+          <w:lang w:val="ru-RU"/>
+        </w:rPr>
+        <w:t>-</w:t>
+      </w:r>
+      <w:r>
+        <w:t>SA</w:t>
+      </w:r>
+      <w:r>
+        <w:rPr>
+          <w:lang w:val="ru-RU"/>
+        </w:rPr>
+        <w:t xml:space="preserve">?) и даже то, проверял ли кто-то лицензию. Исправить по догадке нельзя — нужно подтверждение по первоисточнику. Корректно: </w:t>
+      </w:r>
+      <w:r>
         <w:t>CC</w:t>
       </w:r>
       <w:r>
         <w:rPr>
-          <w:b/>
           <w:lang w:val="ru-RU"/>
         </w:rPr>
         <w:t>-</w:t>
       </w:r>
       <w:r>
-        <w:rPr>
-          <w:b/>
-        </w:rPr>
         <w:t>BY</w:t>
       </w:r>
       <w:r>
         <w:rPr>
-          <w:b/>
-          <w:lang w:val="ru-RU"/>
-        </w:rPr>
-        <w:t>-</w:t>
-      </w:r>
-      <w:r>
-        <w:rPr>
-          <w:b/>
-        </w:rPr>
-        <w:t>NC</w:t>
-      </w:r>
-      <w:r>
-        <w:rPr>
-          <w:b/>
-          <w:lang w:val="ru-RU"/>
-        </w:rPr>
-        <w:t>-</w:t>
-      </w:r>
-      <w:r>
-        <w:rPr>
-          <w:b/>
-        </w:rPr>
-        <w:t>SA</w:t>
-      </w:r>
-      <w:r>
-        <w:rPr>
-          <w:b/>
-          <w:lang w:val="ru-RU"/>
-        </w:rPr>
-        <w:t>-4.0 получили по две находки? Как снять обе одним решением?</w:t>
+          <w:lang w:val="ru-RU"/>
+        </w:rPr>
+        <w:t>-4.0.</w:t>
       </w:r>
     </w:p>
     <w:p>
@@ -11457,45 +10397,62 @@
       </w:pPr>
       <w:r>
         <w:rPr>
-          <w:lang w:val="ru-RU"/>
-        </w:rPr>
-        <w:t xml:space="preserve">Лицензия содержит и </w:t>
-      </w:r>
-      <w:r>
+          <w:b/>
+          <w:lang w:val="ru-RU"/>
+        </w:rPr>
+        <w:t xml:space="preserve">4. Почему в демо два объекта с </w:t>
+      </w:r>
+      <w:r>
+        <w:rPr>
+          <w:b/>
+        </w:rPr>
+        <w:t>CC</w:t>
+      </w:r>
+      <w:r>
+        <w:rPr>
+          <w:b/>
+          <w:lang w:val="ru-RU"/>
+        </w:rPr>
+        <w:t>-</w:t>
+      </w:r>
+      <w:r>
+        <w:rPr>
+          <w:b/>
+        </w:rPr>
+        <w:t>BY</w:t>
+      </w:r>
+      <w:r>
+        <w:rPr>
+          <w:b/>
+          <w:lang w:val="ru-RU"/>
+        </w:rPr>
+        <w:t>-</w:t>
+      </w:r>
+      <w:r>
+        <w:rPr>
+          <w:b/>
+        </w:rPr>
         <w:t>NC</w:t>
       </w:r>
       <w:r>
         <w:rPr>
-          <w:lang w:val="ru-RU"/>
-        </w:rPr>
-        <w:t xml:space="preserve"> (</w:t>
-      </w:r>
-      <w:r>
-        <w:t>R</w:t>
-      </w:r>
-      <w:r>
-        <w:rPr>
-          <w:lang w:val="ru-RU"/>
-        </w:rPr>
-        <w:t xml:space="preserve">3 при коммерческом использовании), и </w:t>
-      </w:r>
-      <w:r>
+          <w:b/>
+          <w:lang w:val="ru-RU"/>
+        </w:rPr>
+        <w:t>-</w:t>
+      </w:r>
+      <w:r>
+        <w:rPr>
+          <w:b/>
+        </w:rPr>
         <w:t>SA</w:t>
       </w:r>
       <w:r>
         <w:rPr>
-          <w:lang w:val="ru-RU"/>
-        </w:rPr>
-        <w:t xml:space="preserve"> (</w:t>
-      </w:r>
-      <w:r>
-        <w:t>R</w:t>
-      </w:r>
-      <w:r>
-        <w:rPr>
-          <w:lang w:val="ru-RU"/>
-        </w:rPr>
-        <w:t>5, потому что передача на тех же условиях недопустима). Решение принимается по объекту: исключение объекта снимает обе находки.</w:t>
+          <w:b/>
+          <w:lang w:val="ru-RU"/>
+        </w:rPr>
+        <w:t>-4.0 получили по две находки? Как снять обе одним решением?</w:t>
       </w:r>
     </w:p>
     <w:p>
@@ -11506,10 +10463,46 @@
       </w:pPr>
       <w:r>
         <w:rPr>
-          <w:b/>
-          <w:lang w:val="ru-RU"/>
-        </w:rPr>
-        <w:t>5. Чем ошибка отличается от предупреждения? Пример предупреждения, которое нельзя оставить без решения.</w:t>
+          <w:lang w:val="ru-RU"/>
+        </w:rPr>
+        <w:lastRenderedPageBreak/>
+        <w:t xml:space="preserve">Лицензия содержит и </w:t>
+      </w:r>
+      <w:r>
+        <w:t>NC</w:t>
+      </w:r>
+      <w:r>
+        <w:rPr>
+          <w:lang w:val="ru-RU"/>
+        </w:rPr>
+        <w:t xml:space="preserve"> (</w:t>
+      </w:r>
+      <w:r>
+        <w:t>R</w:t>
+      </w:r>
+      <w:r>
+        <w:rPr>
+          <w:lang w:val="ru-RU"/>
+        </w:rPr>
+        <w:t xml:space="preserve">3 при коммерческом использовании), и </w:t>
+      </w:r>
+      <w:r>
+        <w:t>SA</w:t>
+      </w:r>
+      <w:r>
+        <w:rPr>
+          <w:lang w:val="ru-RU"/>
+        </w:rPr>
+        <w:t xml:space="preserve"> (</w:t>
+      </w:r>
+      <w:r>
+        <w:t>R</w:t>
+      </w:r>
+      <w:r>
+        <w:rPr>
+          <w:lang w:val="ru-RU"/>
+        </w:rPr>
+        <w:t>5, потому что передача на тех же условиях недопустима). Решение принимается по объекту: исключение объекта снимает обе находки.</w:t>
       </w:r>
     </w:p>
     <w:p>
@@ -11520,36 +10513,10 @@
       </w:pPr>
       <w:r>
         <w:rPr>
-          <w:lang w:val="ru-RU"/>
-        </w:rPr>
-        <w:t xml:space="preserve">Ошибка — прямой конфликт с политикой: объект использовать нельзя. Предупреждение требует решения, но не запрещает объект автоматически. Пример из варианта 18: </w:t>
-      </w:r>
-      <w:r>
-        <w:t>R</w:t>
-      </w:r>
-      <w:r>
-        <w:rPr>
-          <w:lang w:val="ru-RU"/>
-        </w:rPr>
-        <w:t xml:space="preserve">8 у </w:t>
-      </w:r>
-      <w:r>
-        <w:t>item</w:t>
-      </w:r>
-      <w:r>
-        <w:rPr>
-          <w:lang w:val="ru-RU"/>
-        </w:rPr>
-        <w:t xml:space="preserve">07 — нет источника у объекта с заявленной </w:t>
-      </w:r>
-      <w:r>
-        <w:t>CC</w:t>
-      </w:r>
-      <w:r>
-        <w:rPr>
-          <w:lang w:val="ru-RU"/>
-        </w:rPr>
-        <w:t>0. Без решения объект попал бы в открытую публикацию с непроверяемыми правами.</w:t>
+          <w:b/>
+          <w:lang w:val="ru-RU"/>
+        </w:rPr>
+        <w:t>5. Чем ошибка отличается от предупреждения? Пример предупреждения, которое нельзя оставить без решения.</w:t>
       </w:r>
     </w:p>
     <w:p>
@@ -11560,36 +10527,36 @@
       </w:pPr>
       <w:r>
         <w:rPr>
-          <w:b/>
-          <w:lang w:val="ru-RU"/>
-        </w:rPr>
-        <w:t>6. 12 объектов, 4 с персональными данными: 1 без согласия, 2 с документом, 1 «</w:t>
-      </w:r>
-      <w:r>
-        <w:rPr>
-          <w:b/>
-        </w:rPr>
-        <w:t>n</w:t>
-      </w:r>
-      <w:r>
-        <w:rPr>
-          <w:b/>
-          <w:lang w:val="ru-RU"/>
-        </w:rPr>
-        <w:t>-</w:t>
-      </w:r>
-      <w:r>
-        <w:rPr>
-          <w:b/>
-        </w:rPr>
-        <w:t>a</w:t>
-      </w:r>
-      <w:r>
-        <w:rPr>
-          <w:b/>
-          <w:lang w:val="ru-RU"/>
-        </w:rPr>
-        <w:t>». Сколько ошибок и предупреждений?</w:t>
+          <w:lang w:val="ru-RU"/>
+        </w:rPr>
+        <w:t xml:space="preserve">Ошибка — прямой конфликт с политикой: объект использовать нельзя. Предупреждение требует решения, но не запрещает объект автоматически. Пример из варианта 18: </w:t>
+      </w:r>
+      <w:r>
+        <w:t>R</w:t>
+      </w:r>
+      <w:r>
+        <w:rPr>
+          <w:lang w:val="ru-RU"/>
+        </w:rPr>
+        <w:t xml:space="preserve">8 у </w:t>
+      </w:r>
+      <w:r>
+        <w:t>item</w:t>
+      </w:r>
+      <w:r>
+        <w:rPr>
+          <w:lang w:val="ru-RU"/>
+        </w:rPr>
+        <w:t xml:space="preserve">07 — нет источника у объекта с заявленной </w:t>
+      </w:r>
+      <w:r>
+        <w:t>CC</w:t>
+      </w:r>
+      <w:r>
+        <w:rPr>
+          <w:lang w:val="ru-RU"/>
+        </w:rPr>
+        <w:t>0. Без решения объект попал бы в открытую публикацию с непроверяемыми правами.</w:t>
       </w:r>
     </w:p>
     <w:p>
@@ -11600,45 +10567,36 @@
       </w:pPr>
       <w:r>
         <w:rPr>
-          <w:lang w:val="ru-RU"/>
-        </w:rPr>
-        <w:t>С публикацией: ошибок 2 (</w:t>
-      </w:r>
-      <w:r>
-        <w:t>R</w:t>
-      </w:r>
-      <w:r>
-        <w:rPr>
-          <w:lang w:val="ru-RU"/>
-        </w:rPr>
-        <w:t>6: без согласия и «</w:t>
-      </w:r>
-      <w:r>
+          <w:b/>
+          <w:lang w:val="ru-RU"/>
+        </w:rPr>
+        <w:t>6. 12 объектов, 4 с персональными данными: 1 без согласия, 2 с документом, 1 «</w:t>
+      </w:r>
+      <w:r>
+        <w:rPr>
+          <w:b/>
+        </w:rPr>
         <w:t>n</w:t>
       </w:r>
       <w:r>
         <w:rPr>
+          <w:b/>
           <w:lang w:val="ru-RU"/>
         </w:rPr>
         <w:t>-</w:t>
       </w:r>
       <w:r>
+        <w:rPr>
+          <w:b/>
+        </w:rPr>
         <w:t>a</w:t>
       </w:r>
       <w:r>
         <w:rPr>
-          <w:lang w:val="ru-RU"/>
-        </w:rPr>
-        <w:t>»), предупреждений 2 (</w:t>
-      </w:r>
-      <w:r>
-        <w:t>R</w:t>
-      </w:r>
-      <w:r>
-        <w:rPr>
-          <w:lang w:val="ru-RU"/>
-        </w:rPr>
-        <w:t>7: два документа-согласия, нужно проверить охват публикации и срок). Без публикации: ошибок 2, предупреждений 0.</w:t>
+          <w:b/>
+          <w:lang w:val="ru-RU"/>
+        </w:rPr>
+        <w:t>». Сколько ошибок и предупреждений?</w:t>
       </w:r>
     </w:p>
     <w:p>
@@ -11649,88 +10607,45 @@
       </w:pPr>
       <w:r>
         <w:rPr>
-          <w:b/>
-          <w:lang w:val="ru-RU"/>
-        </w:rPr>
-        <w:t xml:space="preserve">7. </w:t>
-      </w:r>
-      <w:r>
-        <w:rPr>
-          <w:b/>
-        </w:rPr>
-        <w:t>L</w:t>
-      </w:r>
-      <w:r>
-        <w:rPr>
-          <w:b/>
-          <w:lang w:val="ru-RU"/>
-        </w:rPr>
-        <w:t xml:space="preserve"> = 3, </w:t>
-      </w:r>
-      <w:r>
-        <w:rPr>
-          <w:b/>
-        </w:rPr>
-        <w:t>I</w:t>
-      </w:r>
-      <w:r>
-        <w:rPr>
-          <w:b/>
-          <w:lang w:val="ru-RU"/>
-        </w:rPr>
-        <w:t xml:space="preserve"> = 5 — оценка? Что выше: </w:t>
-      </w:r>
-      <w:r>
-        <w:rPr>
-          <w:b/>
-        </w:rPr>
-        <w:t>L</w:t>
-      </w:r>
-      <w:r>
-        <w:rPr>
-          <w:b/>
-          <w:lang w:val="ru-RU"/>
-        </w:rPr>
-        <w:t xml:space="preserve"> = 4, </w:t>
-      </w:r>
-      <w:r>
-        <w:rPr>
-          <w:b/>
-        </w:rPr>
-        <w:t>I</w:t>
-      </w:r>
-      <w:r>
-        <w:rPr>
-          <w:b/>
-          <w:lang w:val="ru-RU"/>
-        </w:rPr>
-        <w:t xml:space="preserve"> = 3 или </w:t>
-      </w:r>
-      <w:r>
-        <w:rPr>
-          <w:b/>
-        </w:rPr>
-        <w:t>L</w:t>
-      </w:r>
-      <w:r>
-        <w:rPr>
-          <w:b/>
-          <w:lang w:val="ru-RU"/>
-        </w:rPr>
-        <w:t xml:space="preserve"> = 2, </w:t>
-      </w:r>
-      <w:r>
-        <w:rPr>
-          <w:b/>
-        </w:rPr>
-        <w:t>I</w:t>
-      </w:r>
-      <w:r>
-        <w:rPr>
-          <w:b/>
-          <w:lang w:val="ru-RU"/>
-        </w:rPr>
-        <w:t xml:space="preserve"> = 5?</w:t>
+          <w:lang w:val="ru-RU"/>
+        </w:rPr>
+        <w:t>С публикацией: ошибок 2 (</w:t>
+      </w:r>
+      <w:r>
+        <w:t>R</w:t>
+      </w:r>
+      <w:r>
+        <w:rPr>
+          <w:lang w:val="ru-RU"/>
+        </w:rPr>
+        <w:t>6: без согласия и «</w:t>
+      </w:r>
+      <w:r>
+        <w:t>n</w:t>
+      </w:r>
+      <w:r>
+        <w:rPr>
+          <w:lang w:val="ru-RU"/>
+        </w:rPr>
+        <w:t>-</w:t>
+      </w:r>
+      <w:r>
+        <w:t>a</w:t>
+      </w:r>
+      <w:r>
+        <w:rPr>
+          <w:lang w:val="ru-RU"/>
+        </w:rPr>
+        <w:t>»), предупреждений 2 (</w:t>
+      </w:r>
+      <w:r>
+        <w:t>R</w:t>
+      </w:r>
+      <w:r>
+        <w:rPr>
+          <w:lang w:val="ru-RU"/>
+        </w:rPr>
+        <w:t>7: два документа-согласия, нужно проверить охват публикации и срок). Без публикации: ошибок 2, предупреждений 0.</w:t>
       </w:r>
     </w:p>
     <w:p>
@@ -11740,49 +10655,89 @@
         </w:rPr>
       </w:pPr>
       <w:r>
-        <w:t>R</w:t>
-      </w:r>
-      <w:r>
-        <w:rPr>
-          <w:lang w:val="ru-RU"/>
-        </w:rPr>
-        <w:t xml:space="preserve"> = 15. </w:t>
-      </w:r>
-      <w:r>
+        <w:rPr>
+          <w:b/>
+          <w:lang w:val="ru-RU"/>
+        </w:rPr>
+        <w:t xml:space="preserve">7. </w:t>
+      </w:r>
+      <w:r>
+        <w:rPr>
+          <w:b/>
+        </w:rPr>
         <w:t>L</w:t>
       </w:r>
       <w:r>
         <w:rPr>
+          <w:b/>
+          <w:lang w:val="ru-RU"/>
+        </w:rPr>
+        <w:t xml:space="preserve"> = 3, </w:t>
+      </w:r>
+      <w:r>
+        <w:rPr>
+          <w:b/>
+        </w:rPr>
+        <w:t>I</w:t>
+      </w:r>
+      <w:r>
+        <w:rPr>
+          <w:b/>
+          <w:lang w:val="ru-RU"/>
+        </w:rPr>
+        <w:t xml:space="preserve"> = 5 — оценка? Что выше: </w:t>
+      </w:r>
+      <w:r>
+        <w:rPr>
+          <w:b/>
+        </w:rPr>
+        <w:t>L</w:t>
+      </w:r>
+      <w:r>
+        <w:rPr>
+          <w:b/>
           <w:lang w:val="ru-RU"/>
         </w:rPr>
         <w:t xml:space="preserve"> = 4, </w:t>
       </w:r>
       <w:r>
+        <w:rPr>
+          <w:b/>
+        </w:rPr>
         <w:t>I</w:t>
       </w:r>
       <w:r>
         <w:rPr>
-          <w:lang w:val="ru-RU"/>
-        </w:rPr>
-        <w:t xml:space="preserve"> = 3 даёт 12, </w:t>
-      </w:r>
-      <w:r>
+          <w:b/>
+          <w:lang w:val="ru-RU"/>
+        </w:rPr>
+        <w:t xml:space="preserve"> = 3 или </w:t>
+      </w:r>
+      <w:r>
+        <w:rPr>
+          <w:b/>
+        </w:rPr>
         <w:t>L</w:t>
       </w:r>
       <w:r>
         <w:rPr>
+          <w:b/>
           <w:lang w:val="ru-RU"/>
         </w:rPr>
         <w:t xml:space="preserve"> = 2, </w:t>
       </w:r>
       <w:r>
+        <w:rPr>
+          <w:b/>
+        </w:rPr>
         <w:t>I</w:t>
       </w:r>
       <w:r>
         <w:rPr>
-          <w:lang w:val="ru-RU"/>
-        </w:rPr>
-        <w:t xml:space="preserve"> = 5 даёт 10, поэтому выше первый. Оговорка: при равных или близких оценках риск с влиянием 5 часто рассматривают отдельно, так как его последствия необратимы.</w:t>
+          <w:b/>
+          <w:lang w:val="ru-RU"/>
+        </w:rPr>
+        <w:t xml:space="preserve"> = 5?</w:t>
       </w:r>
     </w:p>
     <w:p>
@@ -11792,11 +10747,49 @@
         </w:rPr>
       </w:pPr>
       <w:r>
-        <w:rPr>
-          <w:b/>
-          <w:lang w:val="ru-RU"/>
-        </w:rPr>
-        <w:t>8. Какие разделы карточки модели не удалось заполнить по паспорту ЛР 1 и почему?</w:t>
+        <w:t>R</w:t>
+      </w:r>
+      <w:r>
+        <w:rPr>
+          <w:lang w:val="ru-RU"/>
+        </w:rPr>
+        <w:t xml:space="preserve"> = 15. </w:t>
+      </w:r>
+      <w:r>
+        <w:t>L</w:t>
+      </w:r>
+      <w:r>
+        <w:rPr>
+          <w:lang w:val="ru-RU"/>
+        </w:rPr>
+        <w:t xml:space="preserve"> = 4, </w:t>
+      </w:r>
+      <w:r>
+        <w:t>I</w:t>
+      </w:r>
+      <w:r>
+        <w:rPr>
+          <w:lang w:val="ru-RU"/>
+        </w:rPr>
+        <w:t xml:space="preserve"> = 3 даёт 12, </w:t>
+      </w:r>
+      <w:r>
+        <w:t>L</w:t>
+      </w:r>
+      <w:r>
+        <w:rPr>
+          <w:lang w:val="ru-RU"/>
+        </w:rPr>
+        <w:t xml:space="preserve"> = 2, </w:t>
+      </w:r>
+      <w:r>
+        <w:t>I</w:t>
+      </w:r>
+      <w:r>
+        <w:rPr>
+          <w:lang w:val="ru-RU"/>
+        </w:rPr>
+        <w:t xml:space="preserve"> = 5 даёт 10, поэтому выше первый. Оговорка: при равных или близких оценках риск с влиянием 5 часто рассматривают отдельно, так как его последствия необратимы.</w:t>
       </w:r>
     </w:p>
     <w:p>
@@ -11807,10 +10800,10 @@
       </w:pPr>
       <w:r>
         <w:rPr>
-          <w:lang w:val="ru-RU"/>
-        </w:rPr>
-        <w:lastRenderedPageBreak/>
-        <w:t>Лицензию кода и ответственного: паспорт описывает эксперимент, а не права на код и организацию работы. Ответственный назначен, а лицензию кода студент выбрать не может, потому что код написан авторами курса. Вывод: паспорт эксперимента полезно дополнить полями «лицензия кода» и «ответственный», а для реальной модели — «лицензия весов» и «обучающие данные».</w:t>
+          <w:b/>
+          <w:lang w:val="ru-RU"/>
+        </w:rPr>
+        <w:t>8. Какие разделы карточки модели не удалось заполнить по паспорту ЛР 1 и почему?</w:t>
       </w:r>
     </w:p>
     <w:p>
@@ -11821,36 +10814,9 @@
       </w:pPr>
       <w:r>
         <w:rPr>
-          <w:b/>
-          <w:lang w:val="ru-RU"/>
-        </w:rPr>
-        <w:t xml:space="preserve">9. Почему риск без «признака наступления» плохо управляется? Пример хорошего признака для </w:t>
-      </w:r>
-      <w:r>
-        <w:rPr>
-          <w:b/>
-        </w:rPr>
-        <w:t>Data</w:t>
-      </w:r>
-      <w:r>
-        <w:rPr>
-          <w:b/>
-          <w:lang w:val="ru-RU"/>
-        </w:rPr>
-        <w:t xml:space="preserve"> </w:t>
-      </w:r>
-      <w:r>
-        <w:rPr>
-          <w:b/>
-        </w:rPr>
-        <w:t>Privacy</w:t>
-      </w:r>
-      <w:r>
-        <w:rPr>
-          <w:b/>
-          <w:lang w:val="ru-RU"/>
-        </w:rPr>
-        <w:t>.</w:t>
+          <w:lang w:val="ru-RU"/>
+        </w:rPr>
+        <w:t>Лицензию кода и ответственного: паспорт описывает эксперимент, а не права на код и организацию работы. Ответственный назначен, а лицензию кода студент выбрать не может, потому что код написан авторами курса. Вывод: паспорт эксперимента полезно дополнить полями «лицензия кода» и «ответственный», а для реальной модели — «лицензия весов» и «обучающие данные».</w:t>
       </w:r>
     </w:p>
     <w:p>
@@ -11861,36 +10827,36 @@
       </w:pPr>
       <w:r>
         <w:rPr>
-          <w:lang w:val="ru-RU"/>
-        </w:rPr>
-        <w:t xml:space="preserve">Без наблюдаемого события нельзя понять, что риск реализовался, и вовремя применить меру. Признак «может произойти утечка» бесполезен. Хороший признак: «обнаружен объект с персональными данными при </w:t>
-      </w:r>
-      <w:r>
-        <w:t>personal</w:t>
-      </w:r>
-      <w:r>
-        <w:rPr>
-          <w:lang w:val="ru-RU"/>
-        </w:rPr>
-        <w:t>_</w:t>
-      </w:r>
-      <w:r>
-        <w:t>data</w:t>
-      </w:r>
-      <w:r>
-        <w:rPr>
-          <w:lang w:val="ru-RU"/>
-        </w:rPr>
-        <w:t xml:space="preserve"> = </w:t>
-      </w:r>
-      <w:r>
-        <w:t>no</w:t>
-      </w:r>
-      <w:r>
-        <w:rPr>
-          <w:lang w:val="ru-RU"/>
-        </w:rPr>
-        <w:t xml:space="preserve"> или без документа-согласия».</w:t>
+          <w:b/>
+          <w:lang w:val="ru-RU"/>
+        </w:rPr>
+        <w:t xml:space="preserve">9. Почему риск без «признака наступления» плохо управляется? Пример хорошего признака для </w:t>
+      </w:r>
+      <w:r>
+        <w:rPr>
+          <w:b/>
+        </w:rPr>
+        <w:t>Data</w:t>
+      </w:r>
+      <w:r>
+        <w:rPr>
+          <w:b/>
+          <w:lang w:val="ru-RU"/>
+        </w:rPr>
+        <w:t xml:space="preserve"> </w:t>
+      </w:r>
+      <w:r>
+        <w:rPr>
+          <w:b/>
+        </w:rPr>
+        <w:t>Privacy</w:t>
+      </w:r>
+      <w:r>
+        <w:rPr>
+          <w:b/>
+          <w:lang w:val="ru-RU"/>
+        </w:rPr>
+        <w:t>.</w:t>
       </w:r>
     </w:p>
     <w:p>
@@ -11901,10 +10867,36 @@
       </w:pPr>
       <w:r>
         <w:rPr>
-          <w:b/>
-          <w:lang w:val="ru-RU"/>
-        </w:rPr>
-        <w:t>10. Что скрипт аудита принципиально не может проверить? Как получить недостающие сведения?</w:t>
+          <w:lang w:val="ru-RU"/>
+        </w:rPr>
+        <w:t xml:space="preserve">Без наблюдаемого события нельзя понять, что риск реализовался, и вовремя применить меру. Признак «может произойти утечка» бесполезен. Хороший признак: «обнаружен объект с персональными данными при </w:t>
+      </w:r>
+      <w:r>
+        <w:t>personal</w:t>
+      </w:r>
+      <w:r>
+        <w:rPr>
+          <w:lang w:val="ru-RU"/>
+        </w:rPr>
+        <w:t>_</w:t>
+      </w:r>
+      <w:r>
+        <w:t>data</w:t>
+      </w:r>
+      <w:r>
+        <w:rPr>
+          <w:lang w:val="ru-RU"/>
+        </w:rPr>
+        <w:t xml:space="preserve"> = </w:t>
+      </w:r>
+      <w:r>
+        <w:t>no</w:t>
+      </w:r>
+      <w:r>
+        <w:rPr>
+          <w:lang w:val="ru-RU"/>
+        </w:rPr>
+        <w:t xml:space="preserve"> или без документа-согласия».</w:t>
       </w:r>
     </w:p>
     <w:p>
@@ -11915,37 +10907,23 @@
       </w:pPr>
       <w:r>
         <w:rPr>
-          <w:lang w:val="ru-RU"/>
-        </w:rPr>
-        <w:t xml:space="preserve">Он не может проверить, что лицензия принадлежит объекту, что источник существует, что </w:t>
-      </w:r>
-      <w:proofErr w:type="spellStart"/>
-      <w:r>
-        <w:rPr>
-          <w:lang w:val="ru-RU"/>
-        </w:rPr>
-        <w:t>хеш</w:t>
-      </w:r>
-      <w:proofErr w:type="spellEnd"/>
-      <w:r>
-        <w:rPr>
-          <w:lang w:val="ru-RU"/>
-        </w:rPr>
-        <w:t xml:space="preserve"> соответствует файлу, что согласие корректно и что в содержимом нет персональных данных. Недостающее получают так: первоисточник (страница объекта в архиве), запрос правообладателю, пересчёт </w:t>
-      </w:r>
-      <w:proofErr w:type="spellStart"/>
-      <w:r>
-        <w:rPr>
-          <w:lang w:val="ru-RU"/>
-        </w:rPr>
-        <w:t>хешей</w:t>
-      </w:r>
-      <w:proofErr w:type="spellEnd"/>
-      <w:r>
-        <w:rPr>
-          <w:lang w:val="ru-RU"/>
-        </w:rPr>
-        <w:t xml:space="preserve"> по файлам, ручная проверка содержимого, консультация юриста.</w:t>
+          <w:b/>
+          <w:lang w:val="ru-RU"/>
+        </w:rPr>
+        <w:t>10. Что скрипт аудита принципиально не может проверить? Как получить недостающие сведения?</w:t>
+      </w:r>
+    </w:p>
+    <w:p>
+      <w:pPr>
+        <w:rPr>
+          <w:lang w:val="ru-RU"/>
+        </w:rPr>
+      </w:pPr>
+      <w:r>
+        <w:rPr>
+          <w:lang w:val="ru-RU"/>
+        </w:rPr>
+        <w:t>Он не может проверить, что лицензия принадлежит объекту, что источник существует, что хеш соответствует файлу, что согласие корректно и что в содержимом нет персональных данных. Недостающее получают так: первоисточник (страница объекта в архиве), запрос правообладателю, пересчёт хешей по файлам, ручная проверка содержимого, консультация юриста.</w:t>
       </w:r>
     </w:p>
     <w:sectPr>
@@ -23538,6 +22516,41 @@
       </w:tcPr>
     </w:tblStylePr>
   </w:style>
+  <w:style w:type="character" w:styleId="aff8">
+    <w:name w:val="Hyperlink"/>
+    <w:basedOn w:val="a2"/>
+    <w:uiPriority w:val="99"/>
+    <w:unhideWhenUsed/>
+    <w:rsid w:val="00FA1B03"/>
+    <w:rPr>
+      <w:color w:val="0000FF" w:themeColor="hyperlink"/>
+      <w:u w:val="single"/>
+    </w:rPr>
+  </w:style>
+  <w:style w:type="character" w:styleId="aff9">
+    <w:name w:val="Unresolved Mention"/>
+    <w:basedOn w:val="a2"/>
+    <w:uiPriority w:val="99"/>
+    <w:semiHidden/>
+    <w:unhideWhenUsed/>
+    <w:rsid w:val="00FA1B03"/>
+    <w:rPr>
+      <w:color w:val="605E5C"/>
+      <w:shd w:val="clear" w:color="auto" w:fill="E1DFDD"/>
+    </w:rPr>
+  </w:style>
+  <w:style w:type="character" w:styleId="affa">
+    <w:name w:val="FollowedHyperlink"/>
+    <w:basedOn w:val="a2"/>
+    <w:uiPriority w:val="99"/>
+    <w:semiHidden/>
+    <w:unhideWhenUsed/>
+    <w:rsid w:val="0025699A"/>
+    <w:rPr>
+      <w:color w:val="800080" w:themeColor="followedHyperlink"/>
+      <w:u w:val="single"/>
+    </w:rPr>
+  </w:style>
 </w:styles>
 </file>
 

</xml_diff>

<commit_message>
LR3, update labs and documentation
</commit_message>
<xml_diff>
--- a/docs/LR02/LR02_variant18_report.docx
+++ b/docs/LR02/LR02_variant18_report.docx
@@ -1256,7 +1256,7 @@
           <w:sz w:val="19"/>
         </w:rPr>
         <w:br/>
-        <w:t>$PY src/lab02_model_card.py --passport ../../LR1/lab01/artifacts/v18/passport.json --owner "[ФИО], ..." --out artifacts/model_card.md</w:t>
+        <w:t>$PY src/lab02_model_card.py --passport ../../LR1/lab01/artifacts/v18/passport.json --owner "Беспалый Максим Евгеньевич, ..." --out artifacts/model_card.md</w:t>
       </w:r>
       <w:r>
         <w:rPr>
@@ -3629,7 +3629,7 @@
         <w:rPr>
           <w:lang w:val="ru-RU"/>
         </w:rPr>
-        <w:t xml:space="preserve"> [ФИО], в рамках ЛР 2 (вариант 18). </w:t>
+        <w:t xml:space="preserve"> Беспалый Максим Евгеньевич, в рамках ЛР 2 (вариант 18). </w:t>
       </w:r>
       <w:r>
         <w:t>Финансирования и заказчика нет.</w:t>
@@ -4746,7 +4746,7 @@
         <w:rPr>
           <w:lang w:val="ru-RU"/>
         </w:rPr>
-        <w:t xml:space="preserve"> куратор набора — [ФИО] (в учебной работе). В реальном проекте — назначенный сотрудник университета.</w:t>
+        <w:t xml:space="preserve"> куратор набора — Беспалый Максим Евгеньевич (в учебной работе). В реальном проекте — назначенный сотрудник университета.</w:t>
       </w:r>
     </w:p>
     <w:p>
@@ -5096,7 +5096,7 @@
         <w:rPr>
           <w:lang w:val="ru-RU"/>
         </w:rPr>
-        <w:t>Лицензия кода: не указана. Ответственный: [ФИО], исполнитель ЛР 1, вариант 18.</w:t>
+        <w:t>Лицензия кода: не указана. Ответственный: Беспалый Максим Евгеньевич, исполнитель ЛР 1, вариант 18.</w:t>
       </w:r>
     </w:p>
     <w:p>

</xml_diff>